<commit_message>
:zap: Completed pubnub access manager
Completed pubnub access manager to assign each user a token when
accessing the website that gives them restricted access.
</commit_message>
<xml_diff>
--- a/Sipify_Documentation_Beta.docx
+++ b/Sipify_Documentation_Beta.docx
@@ -95,7 +95,7 @@
           <w:lang w:val="en-GB"/>
         </w:rPr>
         <w:drawing>
-          <wp:anchor distT="0" distB="0" distL="114300" distR="114300" simplePos="0" relativeHeight="251659264" behindDoc="0" locked="0" layoutInCell="1" allowOverlap="1" wp14:anchorId="2CB87D14" wp14:editId="3CA3276E">
+          <wp:anchor distT="0" distB="0" distL="114300" distR="114300" simplePos="0" relativeHeight="251659264" behindDoc="0" locked="0" layoutInCell="1" allowOverlap="1" wp14:anchorId="7F49B8E7" wp14:editId="4A477B5D">
             <wp:simplePos x="0" y="0"/>
             <wp:positionH relativeFrom="column">
               <wp:posOffset>1591646</wp:posOffset>
@@ -686,25 +686,7 @@
             <w:sz w:val="20"/>
             <w:szCs w:val="20"/>
           </w:rPr>
-          <w:t xml:space="preserve">Custom </w:t>
-        </w:r>
-        <w:proofErr w:type="gramStart"/>
-        <w:r>
-          <w:rPr>
-            <w:rFonts w:ascii="Times New Roman" w:hAnsi="Times New Roman" w:cs="Times New Roman"/>
-            <w:sz w:val="20"/>
-            <w:szCs w:val="20"/>
-          </w:rPr>
-          <w:t>Domain..</w:t>
-        </w:r>
-        <w:proofErr w:type="gramEnd"/>
-        <w:r>
-          <w:rPr>
-            <w:rFonts w:ascii="Times New Roman" w:hAnsi="Times New Roman" w:cs="Times New Roman"/>
-            <w:sz w:val="20"/>
-            <w:szCs w:val="20"/>
-          </w:rPr>
-          <w:t>…………………………………………………………………………</w:t>
+          <w:t>Custom Domain..…………………………………………………………………………</w:t>
         </w:r>
         <w:r>
           <w:rPr>
@@ -833,18 +815,7 @@
           <w:szCs w:val="20"/>
           <w:lang w:val="en-GB"/>
         </w:rPr>
-        <w:t>2</w:t>
-      </w:r>
-      <w:r>
-        <w:rPr>
-          <w:rFonts w:ascii="Times New Roman" w:hAnsi="Times New Roman" w:cs="Times New Roman"/>
-          <w:b/>
-          <w:bCs/>
-          <w:sz w:val="20"/>
-          <w:szCs w:val="20"/>
-          <w:lang w:val="en-GB"/>
-        </w:rPr>
-        <w:t xml:space="preserve">.3 </w:t>
+        <w:t xml:space="preserve">2.3 </w:t>
       </w:r>
       <w:r>
         <w:rPr>
@@ -1120,27 +1091,7 @@
             <w:szCs w:val="20"/>
             <w:lang w:val="en-GB"/>
           </w:rPr>
-          <w:t>evice……</w:t>
-        </w:r>
-        <w:proofErr w:type="gramStart"/>
-        <w:r>
-          <w:rPr>
-            <w:rFonts w:ascii="Times New Roman" w:hAnsi="Times New Roman" w:cs="Times New Roman"/>
-            <w:sz w:val="20"/>
-            <w:szCs w:val="20"/>
-            <w:lang w:val="en-GB"/>
-          </w:rPr>
-          <w:t>…..</w:t>
-        </w:r>
-        <w:proofErr w:type="gramEnd"/>
-        <w:r>
-          <w:rPr>
-            <w:rFonts w:ascii="Times New Roman" w:hAnsi="Times New Roman" w:cs="Times New Roman"/>
-            <w:sz w:val="20"/>
-            <w:szCs w:val="20"/>
-            <w:lang w:val="en-GB"/>
-          </w:rPr>
-          <w:t>…</w:t>
+          <w:t>evice………..…</w:t>
         </w:r>
         <w:r>
           <w:rPr>
@@ -1232,7 +1183,6 @@
           </w:rPr>
           <w:t>………………………………………………</w:t>
         </w:r>
-        <w:proofErr w:type="gramStart"/>
         <w:r>
           <w:rPr>
             <w:rFonts w:ascii="Times New Roman" w:hAnsi="Times New Roman" w:cs="Times New Roman"/>
@@ -1251,7 +1201,6 @@
           </w:rPr>
           <w:t>..</w:t>
         </w:r>
-        <w:proofErr w:type="gramEnd"/>
       </w:hyperlink>
     </w:p>
     <w:p>
@@ -1396,7 +1345,6 @@
           </w:rPr>
           <w:t>…</w:t>
         </w:r>
-        <w:proofErr w:type="gramStart"/>
         <w:r>
           <w:rPr>
             <w:rFonts w:ascii="Times New Roman" w:hAnsi="Times New Roman" w:cs="Times New Roman"/>
@@ -1406,7 +1354,6 @@
           </w:rPr>
           <w:t>…..</w:t>
         </w:r>
-        <w:proofErr w:type="gramEnd"/>
       </w:hyperlink>
     </w:p>
     <w:p>
@@ -1581,7 +1528,7 @@
           <w:lang w:val="en-GB"/>
         </w:rPr>
         <w:drawing>
-          <wp:inline distT="0" distB="0" distL="0" distR="0" wp14:anchorId="2681B5F0" wp14:editId="5800E93B">
+          <wp:inline distT="0" distB="0" distL="0" distR="0" wp14:anchorId="33548BF5" wp14:editId="4D8A026E">
             <wp:extent cx="4914900" cy="3829113"/>
             <wp:effectExtent l="0" t="0" r="0" b="0"/>
             <wp:docPr id="2061678793" name="Picture 1" descr="A diagram of a network"/>
@@ -1639,33 +1586,35 @@
       <w:r>
         <w:t xml:space="preserve">Figure </w:t>
       </w:r>
-      <w:fldSimple w:instr=" SEQ Figure \* ARABIC ">
-        <w:r>
-          <w:rPr>
-            <w:noProof/>
-          </w:rPr>
-          <w:t>1</w:t>
-        </w:r>
-      </w:fldSimple>
-      <w:r>
-        <w:t xml:space="preserve"> </w:t>
-      </w:r>
-      <w:proofErr w:type="gramStart"/>
-      <w:r>
-        <w:t xml:space="preserve">Updated </w:t>
+      <w:r>
+        <w:fldChar w:fldCharType="begin"/>
+      </w:r>
+      <w:r>
+        <w:instrText xml:space="preserve"> SEQ Figure \* ARABIC </w:instrText>
+      </w:r>
+      <w:r>
+        <w:fldChar w:fldCharType="separate"/>
       </w:r>
       <w:r>
         <w:rPr>
           <w:noProof/>
         </w:rPr>
-        <w:t xml:space="preserve"> System</w:t>
-      </w:r>
-      <w:proofErr w:type="gramEnd"/>
+        <w:t>1</w:t>
+      </w:r>
       <w:r>
         <w:rPr>
           <w:noProof/>
         </w:rPr>
-        <w:t xml:space="preserve"> Architecture Diagram</w:t>
+        <w:fldChar w:fldCharType="end"/>
+      </w:r>
+      <w:r>
+        <w:t xml:space="preserve"> Updated </w:t>
+      </w:r>
+      <w:r>
+        <w:rPr>
+          <w:noProof/>
+        </w:rPr>
+        <w:t xml:space="preserve"> System Architecture Diagram</w:t>
       </w:r>
     </w:p>
     <w:p>
@@ -1796,67 +1745,7 @@
           <w:szCs w:val="24"/>
           <w:lang w:val="en-GB"/>
         </w:rPr>
-        <w:t xml:space="preserve">Using godaddy.com I was able to purchase a custom domain for the project. I had been given a number of different options for the domain name and after a long discussion with the team, we decided on </w:t>
-      </w:r>
-      <w:proofErr w:type="spellStart"/>
-      <w:proofErr w:type="gramStart"/>
-      <w:r>
-        <w:rPr>
-          <w:rFonts w:ascii="Times New Roman" w:hAnsi="Times New Roman" w:cs="Times New Roman"/>
-          <w:sz w:val="24"/>
-          <w:szCs w:val="24"/>
-          <w:lang w:val="en-GB"/>
-        </w:rPr>
-        <w:t>sipify.site</w:t>
-      </w:r>
-      <w:proofErr w:type="spellEnd"/>
-      <w:proofErr w:type="gramEnd"/>
-      <w:r>
-        <w:rPr>
-          <w:rFonts w:ascii="Times New Roman" w:hAnsi="Times New Roman" w:cs="Times New Roman"/>
-          <w:sz w:val="24"/>
-          <w:szCs w:val="24"/>
-          <w:lang w:val="en-GB"/>
-        </w:rPr>
-        <w:t xml:space="preserve">. After gaining access to the </w:t>
-      </w:r>
-      <w:proofErr w:type="gramStart"/>
-      <w:r>
-        <w:rPr>
-          <w:rFonts w:ascii="Times New Roman" w:hAnsi="Times New Roman" w:cs="Times New Roman"/>
-          <w:sz w:val="24"/>
-          <w:szCs w:val="24"/>
-          <w:lang w:val="en-GB"/>
-        </w:rPr>
-        <w:t>domain</w:t>
-      </w:r>
-      <w:proofErr w:type="gramEnd"/>
-      <w:r>
-        <w:rPr>
-          <w:rFonts w:ascii="Times New Roman" w:hAnsi="Times New Roman" w:cs="Times New Roman"/>
-          <w:sz w:val="24"/>
-          <w:szCs w:val="24"/>
-          <w:lang w:val="en-GB"/>
-        </w:rPr>
-        <w:t xml:space="preserve"> I created a hosted zone for the domain on Route53. Using this I was given access to AWS name servers to route traffic to my domain. I created a record for my domain and assigned the I</w:t>
-      </w:r>
-      <w:r>
-        <w:rPr>
-          <w:rFonts w:ascii="Times New Roman" w:hAnsi="Times New Roman" w:cs="Times New Roman"/>
-          <w:sz w:val="24"/>
-          <w:szCs w:val="24"/>
-          <w:lang w:val="en-GB"/>
-        </w:rPr>
-        <w:t>p</w:t>
-      </w:r>
-      <w:r>
-        <w:rPr>
-          <w:rFonts w:ascii="Times New Roman" w:hAnsi="Times New Roman" w:cs="Times New Roman"/>
-          <w:sz w:val="24"/>
-          <w:szCs w:val="24"/>
-          <w:lang w:val="en-GB"/>
-        </w:rPr>
-        <w:t xml:space="preserve">v4 address from my instance to route the traffic to connect my project with the domain. </w:t>
+        <w:t xml:space="preserve">Using godaddy.com I was able to purchase a custom domain for the project. I had been given a number of different options for the domain name and after a long discussion with the team, we decided on sipify.site. After gaining access to the domain I created a hosted zone for the domain on Route53. Using this I was given access to AWS name servers to route traffic to my domain. I created a record for my domain and assigned the Ipv4 address from my instance to route the traffic to connect my project with the domain. </w:t>
       </w:r>
     </w:p>
     <w:p>
@@ -1879,7 +1768,7 @@
         </w:rPr>
         <w:lastRenderedPageBreak/>
         <w:drawing>
-          <wp:inline distT="0" distB="0" distL="0" distR="0" wp14:anchorId="7C371120" wp14:editId="6798E472">
+          <wp:inline distT="0" distB="0" distL="0" distR="0" wp14:anchorId="428C1A4A" wp14:editId="13D96B0B">
             <wp:extent cx="3896139" cy="4453475"/>
             <wp:effectExtent l="0" t="0" r="9525" b="4445"/>
             <wp:docPr id="702711190" name="Picture 4" descr="A screenshot of a computer&#10;&#10;Description automatically generated"/>
@@ -1944,7 +1833,7 @@
           <w:lang w:val="en-GB"/>
         </w:rPr>
         <w:drawing>
-          <wp:inline distT="0" distB="0" distL="0" distR="0" wp14:anchorId="6F80D1F0" wp14:editId="3C02CCF0">
+          <wp:inline distT="0" distB="0" distL="0" distR="0" wp14:anchorId="16EC3687" wp14:editId="7EF48EFD">
             <wp:extent cx="3735994" cy="3315694"/>
             <wp:effectExtent l="0" t="0" r="0" b="0"/>
             <wp:docPr id="1319254699" name="Picture 5" descr="A screenshot of a computer&#10;&#10;Description automatically generated"/>
@@ -2007,27 +1896,7 @@
           <w:szCs w:val="24"/>
           <w:lang w:val="en-GB"/>
         </w:rPr>
-        <w:t xml:space="preserve">I then changed the </w:t>
-      </w:r>
-      <w:proofErr w:type="spellStart"/>
-      <w:r>
-        <w:rPr>
-          <w:rFonts w:ascii="Times New Roman" w:hAnsi="Times New Roman" w:cs="Times New Roman"/>
-          <w:sz w:val="24"/>
-          <w:szCs w:val="24"/>
-          <w:lang w:val="en-GB"/>
-        </w:rPr>
-        <w:t>godaddy</w:t>
-      </w:r>
-      <w:proofErr w:type="spellEnd"/>
-      <w:r>
-        <w:rPr>
-          <w:rFonts w:ascii="Times New Roman" w:hAnsi="Times New Roman" w:cs="Times New Roman"/>
-          <w:sz w:val="24"/>
-          <w:szCs w:val="24"/>
-          <w:lang w:val="en-GB"/>
-        </w:rPr>
-        <w:t xml:space="preserve"> nameservers for my domain to be the custom nameservers that route53 provided to successfully route the domain to the instance. I then created a record to </w:t>
+        <w:t xml:space="preserve">I then changed the godaddy nameservers for my domain to be the custom nameservers that route53 provided to successfully route the domain to the instance. I then created a record to </w:t>
       </w:r>
       <w:r>
         <w:rPr>
@@ -2037,29 +1906,7 @@
           <w:lang w:val="en-GB"/>
         </w:rPr>
         <w:lastRenderedPageBreak/>
-        <w:t xml:space="preserve">allow www. to be used to access the website as well. This record allowed the website to be accessed using </w:t>
-      </w:r>
-      <w:proofErr w:type="spellStart"/>
-      <w:proofErr w:type="gramStart"/>
-      <w:r>
-        <w:rPr>
-          <w:rFonts w:ascii="Times New Roman" w:hAnsi="Times New Roman" w:cs="Times New Roman"/>
-          <w:sz w:val="24"/>
-          <w:szCs w:val="24"/>
-          <w:lang w:val="en-GB"/>
-        </w:rPr>
-        <w:t>sipify.site</w:t>
-      </w:r>
-      <w:proofErr w:type="spellEnd"/>
-      <w:proofErr w:type="gramEnd"/>
-      <w:r>
-        <w:rPr>
-          <w:rFonts w:ascii="Times New Roman" w:hAnsi="Times New Roman" w:cs="Times New Roman"/>
-          <w:sz w:val="24"/>
-          <w:szCs w:val="24"/>
-          <w:lang w:val="en-GB"/>
-        </w:rPr>
-        <w:t xml:space="preserve"> or </w:t>
+        <w:t xml:space="preserve">allow www. to be used to access the website as well. This record allowed the website to be accessed using sipify.site or </w:t>
       </w:r>
       <w:hyperlink r:id="rId11" w:history="1">
         <w:r>
@@ -2097,7 +1944,7 @@
           <w:lang w:val="en-GB"/>
         </w:rPr>
         <w:drawing>
-          <wp:inline distT="0" distB="0" distL="0" distR="0" wp14:anchorId="527CEAA1" wp14:editId="1D41FB5B">
+          <wp:inline distT="0" distB="0" distL="0" distR="0" wp14:anchorId="071E77B9" wp14:editId="36E3B8C4">
             <wp:extent cx="5731510" cy="2955290"/>
             <wp:effectExtent l="0" t="0" r="2540" b="0"/>
             <wp:docPr id="1103106655" name="Picture 1" descr="A screen shot of a computer&#10;&#10;Description automatically generated"/>
@@ -2153,14 +2000,27 @@
       <w:r>
         <w:t xml:space="preserve">Figure </w:t>
       </w:r>
-      <w:fldSimple w:instr=" SEQ Figure \* ARABIC ">
-        <w:r>
-          <w:rPr>
-            <w:noProof/>
-          </w:rPr>
-          <w:t>2</w:t>
-        </w:r>
-      </w:fldSimple>
+      <w:r>
+        <w:fldChar w:fldCharType="begin"/>
+      </w:r>
+      <w:r>
+        <w:instrText xml:space="preserve"> SEQ Figure \* ARABIC </w:instrText>
+      </w:r>
+      <w:r>
+        <w:fldChar w:fldCharType="separate"/>
+      </w:r>
+      <w:r>
+        <w:rPr>
+          <w:noProof/>
+        </w:rPr>
+        <w:t>2</w:t>
+      </w:r>
+      <w:r>
+        <w:rPr>
+          <w:noProof/>
+        </w:rPr>
+        <w:fldChar w:fldCharType="end"/>
+      </w:r>
       <w:r>
         <w:t xml:space="preserve"> Accessing website without www</w:t>
       </w:r>
@@ -2179,7 +2039,7 @@
           <w:lang w:val="en-GB"/>
         </w:rPr>
         <w:drawing>
-          <wp:inline distT="0" distB="0" distL="0" distR="0" wp14:anchorId="075495DF" wp14:editId="53064E3F">
+          <wp:inline distT="0" distB="0" distL="0" distR="0" wp14:anchorId="593418C2" wp14:editId="3EA6B759">
             <wp:extent cx="5731510" cy="2955290"/>
             <wp:effectExtent l="0" t="0" r="2540" b="0"/>
             <wp:docPr id="1560782050" name="Picture 2" descr="A screen shot of a computer&#10;&#10;Description automatically generated"/>
@@ -2229,14 +2089,27 @@
       <w:r>
         <w:t xml:space="preserve">Figure </w:t>
       </w:r>
-      <w:fldSimple w:instr=" SEQ Figure \* ARABIC ">
-        <w:r>
-          <w:rPr>
-            <w:noProof/>
-          </w:rPr>
-          <w:t>3</w:t>
-        </w:r>
-      </w:fldSimple>
+      <w:r>
+        <w:fldChar w:fldCharType="begin"/>
+      </w:r>
+      <w:r>
+        <w:instrText xml:space="preserve"> SEQ Figure \* ARABIC </w:instrText>
+      </w:r>
+      <w:r>
+        <w:fldChar w:fldCharType="separate"/>
+      </w:r>
+      <w:r>
+        <w:rPr>
+          <w:noProof/>
+        </w:rPr>
+        <w:t>3</w:t>
+      </w:r>
+      <w:r>
+        <w:rPr>
+          <w:noProof/>
+        </w:rPr>
+        <w:fldChar w:fldCharType="end"/>
+      </w:r>
       <w:r>
         <w:t xml:space="preserve"> Accessing website using www</w:t>
       </w:r>
@@ -2300,25 +2173,7 @@
           <w:sz w:val="24"/>
           <w:szCs w:val="24"/>
         </w:rPr>
-        <w:t xml:space="preserve">When first creating the AWS server and deploying the project, the website only had unsecure http access. </w:t>
-      </w:r>
-      <w:proofErr w:type="gramStart"/>
-      <w:r>
-        <w:rPr>
-          <w:rFonts w:ascii="Times New Roman" w:hAnsi="Times New Roman" w:cs="Times New Roman"/>
-          <w:sz w:val="24"/>
-          <w:szCs w:val="24"/>
-        </w:rPr>
-        <w:t>In reality most</w:t>
-      </w:r>
-      <w:proofErr w:type="gramEnd"/>
-      <w:r>
-        <w:rPr>
-          <w:rFonts w:ascii="Times New Roman" w:hAnsi="Times New Roman" w:cs="Times New Roman"/>
-          <w:sz w:val="24"/>
-          <w:szCs w:val="24"/>
-        </w:rPr>
-        <w:t xml:space="preserve"> users avoid accessing http websites as they are unsecure and can </w:t>
+        <w:t xml:space="preserve">When first creating the AWS server and deploying the project, the website only had unsecure http access. In reality most users avoid accessing http websites as they are unsecure and can </w:t>
       </w:r>
       <w:r>
         <w:rPr>
@@ -2363,7 +2218,7 @@
           <w:szCs w:val="24"/>
         </w:rPr>
         <w:drawing>
-          <wp:inline distT="0" distB="0" distL="0" distR="0" wp14:anchorId="33F4B69B" wp14:editId="4E0E2B7A">
+          <wp:inline distT="0" distB="0" distL="0" distR="0" wp14:anchorId="1CD4A840" wp14:editId="25476DB4">
             <wp:extent cx="5668270" cy="2547769"/>
             <wp:effectExtent l="0" t="0" r="8890" b="5080"/>
             <wp:docPr id="2018236454" name="Picture 4" descr="A screenshot of a computer&#10;&#10;Description automatically generated"/>
@@ -2424,43 +2279,7 @@
           <w:sz w:val="24"/>
           <w:szCs w:val="24"/>
         </w:rPr>
-        <w:t xml:space="preserve">To secure the website and provide a https connection, I used letsencrypt.org to generate an SSL cert for the domain. In the AWS instance I added the inbound rule to allow https requests to the server and redirect all http traffic to https. After using </w:t>
-      </w:r>
-      <w:proofErr w:type="spellStart"/>
-      <w:r>
-        <w:rPr>
-          <w:rFonts w:ascii="Times New Roman" w:hAnsi="Times New Roman" w:cs="Times New Roman"/>
-          <w:sz w:val="24"/>
-          <w:szCs w:val="24"/>
-        </w:rPr>
-        <w:t>certbot</w:t>
-      </w:r>
-      <w:proofErr w:type="spellEnd"/>
-      <w:r>
-        <w:rPr>
-          <w:rFonts w:ascii="Times New Roman" w:hAnsi="Times New Roman" w:cs="Times New Roman"/>
-          <w:sz w:val="24"/>
-          <w:szCs w:val="24"/>
-        </w:rPr>
-        <w:t xml:space="preserve"> to generate the certificate I ran a test on ssllabs.com/</w:t>
-      </w:r>
-      <w:proofErr w:type="spellStart"/>
-      <w:r>
-        <w:rPr>
-          <w:rFonts w:ascii="Times New Roman" w:hAnsi="Times New Roman" w:cs="Times New Roman"/>
-          <w:sz w:val="24"/>
-          <w:szCs w:val="24"/>
-        </w:rPr>
-        <w:t>ssltest</w:t>
-      </w:r>
-      <w:proofErr w:type="spellEnd"/>
-      <w:r>
-        <w:rPr>
-          <w:rFonts w:ascii="Times New Roman" w:hAnsi="Times New Roman" w:cs="Times New Roman"/>
-          <w:sz w:val="24"/>
-          <w:szCs w:val="24"/>
-        </w:rPr>
-        <w:t xml:space="preserve"> to ensure that the certificate was successfully generated and that my domain was now secure.</w:t>
+        <w:t>To secure the website and provide a https connection, I used letsencrypt.org to generate an SSL cert for the domain. In the AWS instance I added the inbound rule to allow https requests to the server and redirect all http traffic to https. After using certbot to generate the certificate I ran a test on ssllabs.com/ssltest to ensure that the certificate was successfully generated and that my domain was now secure.</w:t>
       </w:r>
     </w:p>
     <w:p>
@@ -2480,7 +2299,7 @@
           <w:szCs w:val="24"/>
         </w:rPr>
         <w:drawing>
-          <wp:inline distT="0" distB="0" distL="0" distR="0" wp14:anchorId="10A6D8FD" wp14:editId="6BDF2A70">
+          <wp:inline distT="0" distB="0" distL="0" distR="0" wp14:anchorId="40484CAF" wp14:editId="30B2BB8E">
             <wp:extent cx="3912787" cy="4047214"/>
             <wp:effectExtent l="0" t="0" r="0" b="0"/>
             <wp:docPr id="1119607207" name="Picture 6" descr="A screenshot of a computer&#10;&#10;Description automatically generated"/>
@@ -2558,25 +2377,7 @@
           <w:sz w:val="24"/>
           <w:szCs w:val="24"/>
         </w:rPr>
-        <w:t xml:space="preserve"> certificate provides a secure connection just like all the other websites you would use </w:t>
-      </w:r>
-      <w:proofErr w:type="gramStart"/>
-      <w:r>
-        <w:rPr>
-          <w:rFonts w:ascii="Times New Roman" w:hAnsi="Times New Roman" w:cs="Times New Roman"/>
-          <w:sz w:val="24"/>
-          <w:szCs w:val="24"/>
-        </w:rPr>
-        <w:t>on a daily basis</w:t>
-      </w:r>
-      <w:proofErr w:type="gramEnd"/>
-      <w:r>
-        <w:rPr>
-          <w:rFonts w:ascii="Times New Roman" w:hAnsi="Times New Roman" w:cs="Times New Roman"/>
-          <w:sz w:val="24"/>
-          <w:szCs w:val="24"/>
-        </w:rPr>
-        <w:t>.</w:t>
+        <w:t xml:space="preserve"> certificate provides a secure connection just like all the other websites you would use on a daily basis.</w:t>
       </w:r>
     </w:p>
     <w:p>
@@ -2636,109 +2437,27 @@
           <w:u w:val="single"/>
           <w:lang w:val="en-GB"/>
         </w:rPr>
-        <w:t xml:space="preserve">Available after </w:t>
-      </w:r>
-      <w:r>
-        <w:rPr>
-          <w:rFonts w:ascii="Times New Roman" w:hAnsi="Times New Roman" w:cs="Times New Roman"/>
-          <w:b/>
-          <w:bCs/>
-          <w:sz w:val="28"/>
-          <w:szCs w:val="28"/>
-          <w:u w:val="single"/>
-          <w:lang w:val="en-GB"/>
-        </w:rPr>
-        <w:t>Submission</w:t>
-      </w:r>
-      <w:r>
-        <w:rPr>
-          <w:rFonts w:ascii="Times New Roman" w:hAnsi="Times New Roman" w:cs="Times New Roman"/>
-          <w:b/>
-          <w:bCs/>
-          <w:sz w:val="28"/>
-          <w:szCs w:val="28"/>
-          <w:u w:val="single"/>
-          <w:lang w:val="en-GB"/>
-        </w:rPr>
-        <w:t xml:space="preserve"> – Jamie</w:t>
-      </w:r>
-    </w:p>
-    <w:p>
-      <w:pPr>
-        <w:spacing w:line="360" w:lineRule="auto"/>
-        <w:rPr>
-          <w:rFonts w:ascii="Times New Roman" w:hAnsi="Times New Roman" w:cs="Times New Roman"/>
-          <w:sz w:val="24"/>
-          <w:szCs w:val="24"/>
-          <w:lang w:val="en-GB"/>
-        </w:rPr>
-      </w:pPr>
-      <w:r>
-        <w:rPr>
-          <w:rFonts w:ascii="Times New Roman" w:hAnsi="Times New Roman" w:cs="Times New Roman"/>
-          <w:sz w:val="24"/>
-          <w:szCs w:val="24"/>
-          <w:lang w:val="en-GB"/>
-        </w:rPr>
-        <w:t>A big issue I experienced when working with the AWS server was stopping and starting the instance, which gave new I</w:t>
-      </w:r>
-      <w:r>
-        <w:rPr>
-          <w:rFonts w:ascii="Times New Roman" w:hAnsi="Times New Roman" w:cs="Times New Roman"/>
-          <w:sz w:val="24"/>
-          <w:szCs w:val="24"/>
-          <w:lang w:val="en-GB"/>
-        </w:rPr>
-        <w:t>p</w:t>
-      </w:r>
-      <w:r>
-        <w:rPr>
-          <w:rFonts w:ascii="Times New Roman" w:hAnsi="Times New Roman" w:cs="Times New Roman"/>
-          <w:sz w:val="24"/>
-          <w:szCs w:val="24"/>
-          <w:lang w:val="en-GB"/>
-        </w:rPr>
-        <w:t xml:space="preserve">v4 addresses. I will be keeping the AWS instance running until the beginning of semester 2 so it may be accessed by anyone who wishes to view the website, </w:t>
-      </w:r>
-      <w:proofErr w:type="gramStart"/>
-      <w:r>
-        <w:rPr>
-          <w:rFonts w:ascii="Times New Roman" w:hAnsi="Times New Roman" w:cs="Times New Roman"/>
-          <w:sz w:val="24"/>
-          <w:szCs w:val="24"/>
-          <w:lang w:val="en-GB"/>
-        </w:rPr>
-        <w:t>There</w:t>
-      </w:r>
-      <w:proofErr w:type="gramEnd"/>
-      <w:r>
-        <w:rPr>
-          <w:rFonts w:ascii="Times New Roman" w:hAnsi="Times New Roman" w:cs="Times New Roman"/>
-          <w:sz w:val="24"/>
-          <w:szCs w:val="24"/>
-          <w:lang w:val="en-GB"/>
-        </w:rPr>
-        <w:t xml:space="preserve"> will be an override button included on the website for John so that he can bypass the </w:t>
-      </w:r>
-      <w:proofErr w:type="spellStart"/>
-      <w:r>
-        <w:rPr>
-          <w:rFonts w:ascii="Times New Roman" w:hAnsi="Times New Roman" w:cs="Times New Roman"/>
-          <w:sz w:val="24"/>
-          <w:szCs w:val="24"/>
-          <w:lang w:val="en-GB"/>
-        </w:rPr>
-        <w:t>ldr</w:t>
-      </w:r>
-      <w:proofErr w:type="spellEnd"/>
-      <w:r>
-        <w:rPr>
-          <w:rFonts w:ascii="Times New Roman" w:hAnsi="Times New Roman" w:cs="Times New Roman"/>
-          <w:sz w:val="24"/>
-          <w:szCs w:val="24"/>
-          <w:lang w:val="en-GB"/>
-        </w:rPr>
-        <w:t xml:space="preserve"> detection and view the rest of the project.</w:t>
+        <w:t>Available after Submission – Jamie</w:t>
+      </w:r>
+    </w:p>
+    <w:p>
+      <w:pPr>
+        <w:spacing w:line="360" w:lineRule="auto"/>
+        <w:rPr>
+          <w:rFonts w:ascii="Times New Roman" w:hAnsi="Times New Roman" w:cs="Times New Roman"/>
+          <w:sz w:val="24"/>
+          <w:szCs w:val="24"/>
+          <w:lang w:val="en-GB"/>
+        </w:rPr>
+      </w:pPr>
+      <w:r>
+        <w:rPr>
+          <w:rFonts w:ascii="Times New Roman" w:hAnsi="Times New Roman" w:cs="Times New Roman"/>
+          <w:sz w:val="24"/>
+          <w:szCs w:val="24"/>
+          <w:lang w:val="en-GB"/>
+        </w:rPr>
+        <w:t>A big issue I experienced when working with the AWS server was stopping and starting the instance, which gave new Ipv4 addresses. I will be keeping the AWS instance running until the beginning of semester 2 so it may be accessed by anyone who wishes to view the website, There will be an override button included on the website for John so that he can bypass the ldr detection and view the rest of the project.</w:t>
       </w:r>
     </w:p>
     <w:p>
@@ -2800,7 +2519,6 @@
         </w:rPr>
         <w:t xml:space="preserve"> </w:t>
       </w:r>
-      <w:proofErr w:type="spellStart"/>
       <w:r>
         <w:rPr>
           <w:rFonts w:ascii="Times New Roman" w:hAnsi="Times New Roman" w:cs="Times New Roman"/>
@@ -2812,7 +2530,6 @@
         </w:rPr>
         <w:t>Pubnub</w:t>
       </w:r>
-      <w:proofErr w:type="spellEnd"/>
     </w:p>
     <w:p>
       <w:pPr>
@@ -2887,105 +2604,14 @@
           <w:lang w:val="en-GB"/>
         </w:rPr>
       </w:pPr>
-      <w:proofErr w:type="gramStart"/>
-      <w:r>
-        <w:rPr>
-          <w:rFonts w:ascii="Times New Roman" w:hAnsi="Times New Roman" w:cs="Times New Roman"/>
-          <w:sz w:val="24"/>
-          <w:szCs w:val="24"/>
-          <w:lang w:val="en-GB"/>
-        </w:rPr>
-        <w:t>Unfortunately</w:t>
-      </w:r>
-      <w:proofErr w:type="gramEnd"/>
-      <w:r>
-        <w:rPr>
-          <w:rFonts w:ascii="Times New Roman" w:hAnsi="Times New Roman" w:cs="Times New Roman"/>
-          <w:sz w:val="24"/>
-          <w:szCs w:val="24"/>
-          <w:lang w:val="en-GB"/>
-        </w:rPr>
-        <w:t xml:space="preserve"> I was unable to have access manager completed for this submission. One of the main problems I focused was figuring out a way of granting a token to a user without the use of a login. The access manager documentation on </w:t>
-      </w:r>
-      <w:proofErr w:type="spellStart"/>
-      <w:r>
-        <w:rPr>
-          <w:rFonts w:ascii="Times New Roman" w:hAnsi="Times New Roman" w:cs="Times New Roman"/>
-          <w:sz w:val="24"/>
-          <w:szCs w:val="24"/>
-          <w:lang w:val="en-GB"/>
-        </w:rPr>
-        <w:t>pubnub</w:t>
-      </w:r>
-      <w:proofErr w:type="spellEnd"/>
-      <w:r>
-        <w:rPr>
-          <w:rFonts w:ascii="Times New Roman" w:hAnsi="Times New Roman" w:cs="Times New Roman"/>
-          <w:sz w:val="24"/>
-          <w:szCs w:val="24"/>
-          <w:lang w:val="en-GB"/>
-        </w:rPr>
-        <w:t xml:space="preserve"> is very vague and there isn’t a lot of detail on how to approach this. What I would have like to have done was to grant a token to a user when they logged into the website which would grant read and write access so that they may write the drink they have selected and read in the responses that </w:t>
-      </w:r>
-      <w:proofErr w:type="spellStart"/>
-      <w:r>
-        <w:rPr>
-          <w:rFonts w:ascii="Times New Roman" w:hAnsi="Times New Roman" w:cs="Times New Roman"/>
-          <w:sz w:val="24"/>
-          <w:szCs w:val="24"/>
-          <w:lang w:val="en-GB"/>
-        </w:rPr>
-        <w:t>pubnub</w:t>
-      </w:r>
-      <w:proofErr w:type="spellEnd"/>
-      <w:r>
-        <w:rPr>
-          <w:rFonts w:ascii="Times New Roman" w:hAnsi="Times New Roman" w:cs="Times New Roman"/>
-          <w:sz w:val="24"/>
-          <w:szCs w:val="24"/>
-          <w:lang w:val="en-GB"/>
-        </w:rPr>
-        <w:t xml:space="preserve"> have sent to them. I have both a “</w:t>
-      </w:r>
-      <w:proofErr w:type="spellStart"/>
-      <w:r>
-        <w:rPr>
-          <w:rFonts w:ascii="Times New Roman" w:hAnsi="Times New Roman" w:cs="Times New Roman"/>
-          <w:sz w:val="24"/>
-          <w:szCs w:val="24"/>
-          <w:lang w:val="en-GB"/>
-        </w:rPr>
-        <w:t>Sipify</w:t>
-      </w:r>
-      <w:proofErr w:type="spellEnd"/>
-      <w:r>
-        <w:rPr>
-          <w:rFonts w:ascii="Times New Roman" w:hAnsi="Times New Roman" w:cs="Times New Roman"/>
-          <w:sz w:val="24"/>
-          <w:szCs w:val="24"/>
-          <w:lang w:val="en-GB"/>
-        </w:rPr>
-        <w:t xml:space="preserve">-channel” channel for the </w:t>
-      </w:r>
-      <w:proofErr w:type="spellStart"/>
-      <w:r>
-        <w:rPr>
-          <w:rFonts w:ascii="Times New Roman" w:hAnsi="Times New Roman" w:cs="Times New Roman"/>
-          <w:sz w:val="24"/>
-          <w:szCs w:val="24"/>
-          <w:lang w:val="en-GB"/>
-        </w:rPr>
-        <w:t>ldr</w:t>
-      </w:r>
-      <w:proofErr w:type="spellEnd"/>
-      <w:r>
-        <w:rPr>
-          <w:rFonts w:ascii="Times New Roman" w:hAnsi="Times New Roman" w:cs="Times New Roman"/>
-          <w:sz w:val="24"/>
-          <w:szCs w:val="24"/>
-          <w:lang w:val="en-GB"/>
-        </w:rPr>
-        <w:t xml:space="preserve"> and temperature messages and a “Get-notification” channel which sends the notification to the pi and the pi sends a message based on what LED is triggered.</w:t>
+      <w:r>
+        <w:rPr>
+          <w:rFonts w:ascii="Times New Roman" w:hAnsi="Times New Roman" w:cs="Times New Roman"/>
+          <w:sz w:val="24"/>
+          <w:szCs w:val="24"/>
+          <w:lang w:val="en-GB"/>
+        </w:rPr>
+        <w:t>Unfortunately I was unable to have access manager completed for this submission. One of the main problems I focused was figuring out a way of granting a token to a user without the use of a login. The access manager documentation on pubnub is very vague and there isn’t a lot of detail on how to approach this. What I would have like to have done was to grant a token to a user when they logged into the website which would grant read and write access so that they may write the drink they have selected and read in the responses that pubnub have sent to them. I have both a “Sipify-channel” channel for the ldr and temperature messages and a “Get-notification” channel which sends the notification to the pi and the pi sends a message based on what LED is triggered.</w:t>
       </w:r>
     </w:p>
     <w:p>
@@ -3149,74 +2775,14 @@
           <w:lang w:val="en-GB"/>
         </w:rPr>
       </w:pPr>
-      <w:proofErr w:type="spellStart"/>
-      <w:r>
-        <w:rPr>
-          <w:rFonts w:ascii="Times New Roman" w:hAnsi="Times New Roman" w:cs="Times New Roman"/>
-          <w:sz w:val="24"/>
-          <w:szCs w:val="24"/>
-          <w:lang w:val="en-GB"/>
-        </w:rPr>
-        <w:t>Pubnub</w:t>
-      </w:r>
-      <w:proofErr w:type="spellEnd"/>
-      <w:r>
-        <w:rPr>
-          <w:rFonts w:ascii="Times New Roman" w:hAnsi="Times New Roman" w:cs="Times New Roman"/>
-          <w:sz w:val="24"/>
-          <w:szCs w:val="24"/>
-          <w:lang w:val="en-GB"/>
-        </w:rPr>
-        <w:t xml:space="preserve"> takes security extremely seriously for their </w:t>
-      </w:r>
-      <w:proofErr w:type="gramStart"/>
-      <w:r>
-        <w:rPr>
-          <w:rFonts w:ascii="Times New Roman" w:hAnsi="Times New Roman" w:cs="Times New Roman"/>
-          <w:sz w:val="24"/>
-          <w:szCs w:val="24"/>
-          <w:lang w:val="en-GB"/>
-        </w:rPr>
-        <w:t>users</w:t>
-      </w:r>
-      <w:proofErr w:type="gramEnd"/>
-      <w:r>
-        <w:rPr>
-          <w:rFonts w:ascii="Times New Roman" w:hAnsi="Times New Roman" w:cs="Times New Roman"/>
-          <w:sz w:val="24"/>
-          <w:szCs w:val="24"/>
-          <w:lang w:val="en-GB"/>
-        </w:rPr>
-        <w:t xml:space="preserve"> so it comes with SSL/TLS protocol already enabled. When messages are being sent to </w:t>
-      </w:r>
-      <w:proofErr w:type="spellStart"/>
-      <w:r>
-        <w:rPr>
-          <w:rFonts w:ascii="Times New Roman" w:hAnsi="Times New Roman" w:cs="Times New Roman"/>
-          <w:sz w:val="24"/>
-          <w:szCs w:val="24"/>
-          <w:lang w:val="en-GB"/>
-        </w:rPr>
-        <w:t>pubnub</w:t>
-      </w:r>
-      <w:proofErr w:type="spellEnd"/>
-      <w:r>
-        <w:rPr>
-          <w:rFonts w:ascii="Times New Roman" w:hAnsi="Times New Roman" w:cs="Times New Roman"/>
-          <w:sz w:val="24"/>
-          <w:szCs w:val="24"/>
-          <w:lang w:val="en-GB"/>
-        </w:rPr>
-        <w:t xml:space="preserve"> they are encrypted automatically which ensures that any information being sent between the client and server remains confidential and cannot be accessed by any unauthorised users.</w:t>
-      </w:r>
-      <w:r>
-        <w:rPr>
-          <w:rFonts w:ascii="Times New Roman" w:hAnsi="Times New Roman" w:cs="Times New Roman"/>
-          <w:sz w:val="24"/>
-          <w:szCs w:val="24"/>
-          <w:lang w:val="en-GB"/>
-        </w:rPr>
-        <w:t xml:space="preserve"> This was extremely useful as I didn’t have to worry about creating the TLS security </w:t>
+      <w:r>
+        <w:rPr>
+          <w:rFonts w:ascii="Times New Roman" w:hAnsi="Times New Roman" w:cs="Times New Roman"/>
+          <w:sz w:val="24"/>
+          <w:szCs w:val="24"/>
+          <w:lang w:val="en-GB"/>
+        </w:rPr>
+        <w:t xml:space="preserve">Pubnub takes security extremely seriously for their users so it comes with SSL/TLS protocol already enabled. When messages are being sent to pubnub they are encrypted automatically which ensures that any information being sent between the client and server remains confidential and cannot be accessed by any unauthorised users. This was extremely useful as I didn’t have to worry about creating the TLS security </w:t>
       </w:r>
     </w:p>
     <w:p>
@@ -3297,163 +2863,7 @@
           <w:szCs w:val="24"/>
           <w:lang w:val="en-GB"/>
         </w:rPr>
-        <w:t xml:space="preserve">I established </w:t>
-      </w:r>
-      <w:r>
-        <w:rPr>
-          <w:rFonts w:ascii="Times New Roman" w:hAnsi="Times New Roman" w:cs="Times New Roman"/>
-          <w:sz w:val="24"/>
-          <w:szCs w:val="24"/>
-          <w:lang w:val="en-GB"/>
-        </w:rPr>
-        <w:t>two-way</w:t>
-      </w:r>
-      <w:r>
-        <w:rPr>
-          <w:rFonts w:ascii="Times New Roman" w:hAnsi="Times New Roman" w:cs="Times New Roman"/>
-          <w:sz w:val="24"/>
-          <w:szCs w:val="24"/>
-          <w:lang w:val="en-GB"/>
-        </w:rPr>
-        <w:t xml:space="preserve"> communication with </w:t>
-      </w:r>
-      <w:proofErr w:type="spellStart"/>
-      <w:r>
-        <w:rPr>
-          <w:rFonts w:ascii="Times New Roman" w:hAnsi="Times New Roman" w:cs="Times New Roman"/>
-          <w:sz w:val="24"/>
-          <w:szCs w:val="24"/>
-          <w:lang w:val="en-GB"/>
-        </w:rPr>
-        <w:t>pubnub</w:t>
-      </w:r>
-      <w:proofErr w:type="spellEnd"/>
-      <w:r>
-        <w:rPr>
-          <w:rFonts w:ascii="Times New Roman" w:hAnsi="Times New Roman" w:cs="Times New Roman"/>
-          <w:sz w:val="24"/>
-          <w:szCs w:val="24"/>
-          <w:lang w:val="en-GB"/>
-        </w:rPr>
-        <w:t xml:space="preserve"> for the project. In the beginning the data from the </w:t>
-      </w:r>
-      <w:proofErr w:type="spellStart"/>
-      <w:r>
-        <w:rPr>
-          <w:rFonts w:ascii="Times New Roman" w:hAnsi="Times New Roman" w:cs="Times New Roman"/>
-          <w:sz w:val="24"/>
-          <w:szCs w:val="24"/>
-          <w:lang w:val="en-GB"/>
-        </w:rPr>
-        <w:t>ldr</w:t>
-      </w:r>
-      <w:proofErr w:type="spellEnd"/>
-      <w:r>
-        <w:rPr>
-          <w:rFonts w:ascii="Times New Roman" w:hAnsi="Times New Roman" w:cs="Times New Roman"/>
-          <w:sz w:val="24"/>
-          <w:szCs w:val="24"/>
-          <w:lang w:val="en-GB"/>
-        </w:rPr>
-        <w:t xml:space="preserve"> and temperature sensor are published from the pi to </w:t>
-      </w:r>
-      <w:proofErr w:type="spellStart"/>
-      <w:r>
-        <w:rPr>
-          <w:rFonts w:ascii="Times New Roman" w:hAnsi="Times New Roman" w:cs="Times New Roman"/>
-          <w:sz w:val="24"/>
-          <w:szCs w:val="24"/>
-          <w:lang w:val="en-GB"/>
-        </w:rPr>
-        <w:t>pubnub</w:t>
-      </w:r>
-      <w:proofErr w:type="spellEnd"/>
-      <w:r>
-        <w:rPr>
-          <w:rFonts w:ascii="Times New Roman" w:hAnsi="Times New Roman" w:cs="Times New Roman"/>
-          <w:sz w:val="24"/>
-          <w:szCs w:val="24"/>
-          <w:lang w:val="en-GB"/>
-        </w:rPr>
-        <w:t xml:space="preserve"> and then received on the server to be utilised. The </w:t>
-      </w:r>
-      <w:proofErr w:type="spellStart"/>
-      <w:r>
-        <w:rPr>
-          <w:rFonts w:ascii="Times New Roman" w:hAnsi="Times New Roman" w:cs="Times New Roman"/>
-          <w:sz w:val="24"/>
-          <w:szCs w:val="24"/>
-          <w:lang w:val="en-GB"/>
-        </w:rPr>
-        <w:t>ldr</w:t>
-      </w:r>
-      <w:proofErr w:type="spellEnd"/>
-      <w:r>
-        <w:rPr>
-          <w:rFonts w:ascii="Times New Roman" w:hAnsi="Times New Roman" w:cs="Times New Roman"/>
-          <w:sz w:val="24"/>
-          <w:szCs w:val="24"/>
-          <w:lang w:val="en-GB"/>
-        </w:rPr>
-        <w:t xml:space="preserve"> data was used to display the correct screen on the front-end for whether a cup has been placed onto the coaster or not. The temperature data was sent to the database along with the drink that the user selected to be stored. Using the temperature data the correct notification is displayed on the front-end to the user but is also published to </w:t>
-      </w:r>
-      <w:proofErr w:type="spellStart"/>
-      <w:r>
-        <w:rPr>
-          <w:rFonts w:ascii="Times New Roman" w:hAnsi="Times New Roman" w:cs="Times New Roman"/>
-          <w:sz w:val="24"/>
-          <w:szCs w:val="24"/>
-          <w:lang w:val="en-GB"/>
-        </w:rPr>
-        <w:t>pubnub</w:t>
-      </w:r>
-      <w:proofErr w:type="spellEnd"/>
-      <w:r>
-        <w:rPr>
-          <w:rFonts w:ascii="Times New Roman" w:hAnsi="Times New Roman" w:cs="Times New Roman"/>
-          <w:sz w:val="24"/>
-          <w:szCs w:val="24"/>
-          <w:lang w:val="en-GB"/>
-        </w:rPr>
-        <w:t xml:space="preserve"> on a separate channel. This message is received on the pi which triggers the corresponding LED to visually display to the user if the drink is too hot, too cold or at the perfect temperature.</w:t>
-      </w:r>
-      <w:r>
-        <w:rPr>
-          <w:rFonts w:ascii="Times New Roman" w:hAnsi="Times New Roman" w:cs="Times New Roman"/>
-          <w:sz w:val="24"/>
-          <w:szCs w:val="24"/>
-          <w:lang w:val="en-GB"/>
-        </w:rPr>
-        <w:t xml:space="preserve"> This </w:t>
-      </w:r>
-      <w:proofErr w:type="gramStart"/>
-      <w:r>
-        <w:rPr>
-          <w:rFonts w:ascii="Times New Roman" w:hAnsi="Times New Roman" w:cs="Times New Roman"/>
-          <w:sz w:val="24"/>
-          <w:szCs w:val="24"/>
-          <w:lang w:val="en-GB"/>
-        </w:rPr>
-        <w:t>two way</w:t>
-      </w:r>
-      <w:proofErr w:type="gramEnd"/>
-      <w:r>
-        <w:rPr>
-          <w:rFonts w:ascii="Times New Roman" w:hAnsi="Times New Roman" w:cs="Times New Roman"/>
-          <w:sz w:val="24"/>
-          <w:szCs w:val="24"/>
-          <w:lang w:val="en-GB"/>
-        </w:rPr>
-        <w:t xml:space="preserve"> communic</w:t>
-      </w:r>
-      <w:r>
-        <w:rPr>
-          <w:rFonts w:ascii="Times New Roman" w:hAnsi="Times New Roman" w:cs="Times New Roman"/>
-          <w:sz w:val="24"/>
-          <w:szCs w:val="24"/>
-          <w:lang w:val="en-GB"/>
-        </w:rPr>
-        <w:t>ation was essential when developing the interaction between the server and the hardware and the server with the front-end.</w:t>
+        <w:t>I established two-way communication with pubnub for the project. In the beginning the data from the ldr and temperature sensor are published from the pi to pubnub and then received on the server to be utilised. The ldr data was used to display the correct screen on the front-end for whether a cup has been placed onto the coaster or not. The temperature data was sent to the database along with the drink that the user selected to be stored. Using the temperature data the correct notification is displayed on the front-end to the user but is also published to pubnub on a separate channel. This message is received on the pi which triggers the corresponding LED to visually display to the user if the drink is too hot, too cold or at the perfect temperature. This two way communication was essential when developing the interaction between the server and the hardware and the server with the front-end.</w:t>
       </w:r>
     </w:p>
     <w:p>
@@ -3471,7 +2881,7 @@
           <w:lang w:val="en-GB"/>
         </w:rPr>
         <w:drawing>
-          <wp:inline distT="0" distB="0" distL="0" distR="0" wp14:anchorId="006E1F71" wp14:editId="0852829C">
+          <wp:inline distT="0" distB="0" distL="0" distR="0" wp14:anchorId="53D1F23A" wp14:editId="38468B63">
             <wp:extent cx="6168002" cy="2880360"/>
             <wp:effectExtent l="0" t="0" r="4445" b="0"/>
             <wp:docPr id="855053549" name="Picture 1" descr="A screenshot of a computer&#10;&#10;Description automatically generated"/>
@@ -3527,14 +2937,27 @@
       <w:r>
         <w:t xml:space="preserve">Figure </w:t>
       </w:r>
-      <w:fldSimple w:instr=" SEQ Figure \* ARABIC ">
-        <w:r>
-          <w:rPr>
-            <w:noProof/>
-          </w:rPr>
-          <w:t>4</w:t>
-        </w:r>
-      </w:fldSimple>
+      <w:r>
+        <w:fldChar w:fldCharType="begin"/>
+      </w:r>
+      <w:r>
+        <w:instrText xml:space="preserve"> SEQ Figure \* ARABIC </w:instrText>
+      </w:r>
+      <w:r>
+        <w:fldChar w:fldCharType="separate"/>
+      </w:r>
+      <w:r>
+        <w:rPr>
+          <w:noProof/>
+        </w:rPr>
+        <w:t>4</w:t>
+      </w:r>
+      <w:r>
+        <w:rPr>
+          <w:noProof/>
+        </w:rPr>
+        <w:fldChar w:fldCharType="end"/>
+      </w:r>
       <w:r>
         <w:t xml:space="preserve"> Two-way connection with 2 channels</w:t>
       </w:r>
@@ -3622,7 +3045,6 @@
           <w:lang w:val="en-GB"/>
         </w:rPr>
       </w:pPr>
-      <w:proofErr w:type="gramStart"/>
       <w:r>
         <w:rPr>
           <w:rFonts w:ascii="Times New Roman" w:hAnsi="Times New Roman" w:cs="Times New Roman"/>
@@ -3655,9 +3077,8 @@
           <w:u w:val="single"/>
           <w:lang w:val="en-GB"/>
         </w:rPr>
-        <w:t>Device</w:t>
-      </w:r>
-      <w:proofErr w:type="gramEnd"/>
+        <w:t>Device –</w:t>
+      </w:r>
       <w:r>
         <w:rPr>
           <w:rFonts w:ascii="Times New Roman" w:hAnsi="Times New Roman" w:cs="Times New Roman"/>
@@ -3668,100 +3089,88 @@
           <w:u w:val="single"/>
           <w:lang w:val="en-GB"/>
         </w:rPr>
-        <w:t xml:space="preserve"> –</w:t>
-      </w:r>
-      <w:r>
-        <w:rPr>
-          <w:rFonts w:ascii="Times New Roman" w:hAnsi="Times New Roman" w:cs="Times New Roman"/>
-          <w:b/>
-          <w:bCs/>
-          <w:sz w:val="28"/>
-          <w:szCs w:val="28"/>
+        <w:t xml:space="preserve"> Luke</w:t>
+      </w:r>
+    </w:p>
+    <w:p>
+      <w:pPr>
+        <w:spacing w:line="360" w:lineRule="auto"/>
+        <w:ind w:left="360"/>
+        <w:rPr>
+          <w:rFonts w:ascii="Times New Roman" w:hAnsi="Times New Roman" w:cs="Times New Roman"/>
+          <w:sz w:val="24"/>
+          <w:szCs w:val="24"/>
+          <w:lang w:val="en-GB"/>
+        </w:rPr>
+      </w:pPr>
+      <w:r>
+        <w:rPr>
+          <w:rFonts w:ascii="Times New Roman" w:hAnsi="Times New Roman" w:cs="Times New Roman"/>
+          <w:sz w:val="24"/>
+          <w:szCs w:val="24"/>
+          <w:lang w:val="en-GB"/>
+        </w:rPr>
+        <w:t>I took on a slight security role when constructing the coaster</w:t>
+      </w:r>
+      <w:r>
+        <w:rPr>
+          <w:rFonts w:ascii="Times New Roman" w:hAnsi="Times New Roman" w:cs="Times New Roman"/>
+          <w:sz w:val="24"/>
+          <w:szCs w:val="24"/>
+          <w:lang w:val="en-GB"/>
+        </w:rPr>
+        <w:t xml:space="preserve"> as the role itself was neglected</w:t>
+      </w:r>
+      <w:r>
+        <w:rPr>
+          <w:rFonts w:ascii="Times New Roman" w:hAnsi="Times New Roman" w:cs="Times New Roman"/>
+          <w:sz w:val="24"/>
+          <w:szCs w:val="24"/>
+          <w:lang w:val="en-GB"/>
+        </w:rPr>
+        <w:t>. I tried to incorporate some security designs to ensure the device could not be opened so easily</w:t>
+      </w:r>
+      <w:r>
+        <w:rPr>
+          <w:rFonts w:ascii="Times New Roman" w:hAnsi="Times New Roman" w:cs="Times New Roman"/>
+          <w:sz w:val="24"/>
+          <w:szCs w:val="24"/>
+          <w:lang w:val="en-GB"/>
+        </w:rPr>
+        <w:t xml:space="preserve">. To do this I cut a very small hole that fits a toothpick, holding both trays together while locking it from being separated. </w:t>
+      </w:r>
+      <w:r>
+        <w:rPr>
+          <w:rFonts w:ascii="Times New Roman" w:hAnsi="Times New Roman" w:cs="Times New Roman"/>
+          <w:sz w:val="24"/>
+          <w:szCs w:val="24"/>
+          <w:lang w:val="en-GB"/>
+        </w:rPr>
+        <w:t xml:space="preserve"> </w:t>
+      </w:r>
+    </w:p>
+    <w:p>
+      <w:pPr>
+        <w:spacing w:line="360" w:lineRule="auto"/>
+        <w:ind w:left="360"/>
+        <w:rPr>
+          <w:rFonts w:ascii="Times New Roman" w:hAnsi="Times New Roman" w:cs="Times New Roman"/>
+          <w:sz w:val="24"/>
+          <w:szCs w:val="24"/>
+          <w:lang w:val="en-GB"/>
+        </w:rPr>
+      </w:pPr>
+      <w:r>
+        <w:rPr>
+          <w:rFonts w:ascii="Times New Roman" w:hAnsi="Times New Roman" w:cs="Times New Roman"/>
+          <w:noProof/>
+          <w:sz w:val="24"/>
+          <w:szCs w:val="24"/>
           <w:u w:val="single"/>
           <w:lang w:val="en-GB"/>
         </w:rPr>
-        <w:t xml:space="preserve"> Luke</w:t>
-      </w:r>
-    </w:p>
-    <w:p>
-      <w:pPr>
-        <w:spacing w:line="360" w:lineRule="auto"/>
-        <w:ind w:left="360"/>
-        <w:rPr>
-          <w:rFonts w:ascii="Times New Roman" w:hAnsi="Times New Roman" w:cs="Times New Roman"/>
-          <w:sz w:val="24"/>
-          <w:szCs w:val="24"/>
-          <w:lang w:val="en-GB"/>
-        </w:rPr>
-      </w:pPr>
-      <w:r>
-        <w:rPr>
-          <w:rFonts w:ascii="Times New Roman" w:hAnsi="Times New Roman" w:cs="Times New Roman"/>
-          <w:sz w:val="24"/>
-          <w:szCs w:val="24"/>
-          <w:lang w:val="en-GB"/>
-        </w:rPr>
-        <w:t>I took on a slight security role when constructing the coaster</w:t>
-      </w:r>
-      <w:r>
-        <w:rPr>
-          <w:rFonts w:ascii="Times New Roman" w:hAnsi="Times New Roman" w:cs="Times New Roman"/>
-          <w:sz w:val="24"/>
-          <w:szCs w:val="24"/>
-          <w:lang w:val="en-GB"/>
-        </w:rPr>
-        <w:t xml:space="preserve"> as the role itself was neglected</w:t>
-      </w:r>
-      <w:r>
-        <w:rPr>
-          <w:rFonts w:ascii="Times New Roman" w:hAnsi="Times New Roman" w:cs="Times New Roman"/>
-          <w:sz w:val="24"/>
-          <w:szCs w:val="24"/>
-          <w:lang w:val="en-GB"/>
-        </w:rPr>
-        <w:t>. I tried to incorporate some security designs to ensure the device could not be opened so easily</w:t>
-      </w:r>
-      <w:r>
-        <w:rPr>
-          <w:rFonts w:ascii="Times New Roman" w:hAnsi="Times New Roman" w:cs="Times New Roman"/>
-          <w:sz w:val="24"/>
-          <w:szCs w:val="24"/>
-          <w:lang w:val="en-GB"/>
-        </w:rPr>
-        <w:t xml:space="preserve">. To do this I cut a very small hole that fits a toothpick, holding both trays together while locking it from being separated. </w:t>
-      </w:r>
-      <w:r>
-        <w:rPr>
-          <w:rFonts w:ascii="Times New Roman" w:hAnsi="Times New Roman" w:cs="Times New Roman"/>
-          <w:sz w:val="24"/>
-          <w:szCs w:val="24"/>
-          <w:lang w:val="en-GB"/>
-        </w:rPr>
-        <w:t xml:space="preserve"> </w:t>
-      </w:r>
-    </w:p>
-    <w:p>
-      <w:pPr>
-        <w:spacing w:line="360" w:lineRule="auto"/>
-        <w:ind w:left="360"/>
-        <w:rPr>
-          <w:rFonts w:ascii="Times New Roman" w:hAnsi="Times New Roman" w:cs="Times New Roman"/>
-          <w:sz w:val="24"/>
-          <w:szCs w:val="24"/>
-          <w:lang w:val="en-GB"/>
-        </w:rPr>
-      </w:pPr>
-      <w:r>
-        <w:rPr>
-          <w:rFonts w:ascii="Times New Roman" w:hAnsi="Times New Roman" w:cs="Times New Roman"/>
-          <w:noProof/>
-          <w:sz w:val="24"/>
-          <w:szCs w:val="24"/>
-          <w:u w:val="single"/>
-          <w:lang w:val="en-GB"/>
-        </w:rPr>
         <w:drawing>
-          <wp:inline distT="0" distB="0" distL="0" distR="0" wp14:anchorId="56EE8CCD" wp14:editId="74ECF64C">
+          <wp:inline distT="0" distB="0" distL="0" distR="0" wp14:anchorId="055E3986" wp14:editId="0AD17405">
             <wp:extent cx="5692878" cy="4269972"/>
             <wp:effectExtent l="0" t="0" r="0" b="0"/>
             <wp:docPr id="1316095959" name="Picture 1" descr="A cardboard box on a white surface&#10;&#10;Description automatically generated"/>
@@ -3842,43 +3251,7 @@
           <w:szCs w:val="24"/>
           <w:lang w:val="en-GB"/>
         </w:rPr>
-        <w:t>The image</w:t>
-      </w:r>
-      <w:r>
-        <w:rPr>
-          <w:rFonts w:ascii="Times New Roman" w:hAnsi="Times New Roman" w:cs="Times New Roman"/>
-          <w:sz w:val="24"/>
-          <w:szCs w:val="24"/>
-          <w:lang w:val="en-GB"/>
-        </w:rPr>
-        <w:t>s</w:t>
-      </w:r>
-      <w:r>
-        <w:rPr>
-          <w:rFonts w:ascii="Times New Roman" w:hAnsi="Times New Roman" w:cs="Times New Roman"/>
-          <w:sz w:val="24"/>
-          <w:szCs w:val="24"/>
-          <w:lang w:val="en-GB"/>
-        </w:rPr>
-        <w:t xml:space="preserve"> below </w:t>
-      </w:r>
-      <w:r>
-        <w:rPr>
-          <w:rFonts w:ascii="Times New Roman" w:hAnsi="Times New Roman" w:cs="Times New Roman"/>
-          <w:sz w:val="24"/>
-          <w:szCs w:val="24"/>
-          <w:lang w:val="en-GB"/>
-        </w:rPr>
-        <w:t>show</w:t>
-      </w:r>
-      <w:r>
-        <w:rPr>
-          <w:rFonts w:ascii="Times New Roman" w:hAnsi="Times New Roman" w:cs="Times New Roman"/>
-          <w:sz w:val="24"/>
-          <w:szCs w:val="24"/>
-          <w:lang w:val="en-GB"/>
-        </w:rPr>
-        <w:t xml:space="preserve"> how the Raspberry Pi sits if it were to be sealed up and plugged in. When it is plugged in the wire acts as an anchor, stopping the Pi from moving around the box.</w:t>
+        <w:t>The images below show how the Raspberry Pi sits if it were to be sealed up and plugged in. When it is plugged in the wire acts as an anchor, stopping the Pi from moving around the box.</w:t>
       </w:r>
     </w:p>
     <w:p>
@@ -3902,7 +3275,7 @@
         </w:rPr>
         <w:lastRenderedPageBreak/>
         <w:drawing>
-          <wp:inline distT="0" distB="0" distL="0" distR="0" wp14:anchorId="456620DC" wp14:editId="5639B746">
+          <wp:inline distT="0" distB="0" distL="0" distR="0" wp14:anchorId="205C88FC" wp14:editId="18FFE29F">
             <wp:extent cx="4502386" cy="5046900"/>
             <wp:effectExtent l="0" t="5398" r="953" b="952"/>
             <wp:docPr id="587326136" name="Picture 2" descr="A small piece of electronic device&#10;&#10;Description automatically generated with medium confidence"/>
@@ -3984,7 +3357,7 @@
           <w:lang w:val="en-GB"/>
         </w:rPr>
         <w:drawing>
-          <wp:inline distT="0" distB="0" distL="0" distR="0" wp14:anchorId="0621DAC4" wp14:editId="37BFDACD">
+          <wp:inline distT="0" distB="0" distL="0" distR="0" wp14:anchorId="2BA5B4A5" wp14:editId="0F0FF157">
             <wp:extent cx="4915766" cy="3687097"/>
             <wp:effectExtent l="0" t="0" r="0" b="0"/>
             <wp:docPr id="612096370" name="Picture 4" descr="A cardboard box with a white cord plugged into it&#10;&#10;Description automatically generated"/>
@@ -4056,19 +3429,29 @@
           <w:lang w:val="en-GB"/>
         </w:rPr>
         <w:lastRenderedPageBreak/>
-        <w:t>C</w:t>
-      </w:r>
-      <w:r>
-        <w:rPr>
-          <w:rFonts w:ascii="Times New Roman" w:hAnsi="Times New Roman" w:cs="Times New Roman"/>
-          <w:b/>
-          <w:bCs/>
-          <w:sz w:val="28"/>
-          <w:szCs w:val="28"/>
-          <w:u w:val="single"/>
-          <w:lang w:val="en-GB"/>
-        </w:rPr>
-        <w:t>ommunication channels – Jamie</w:t>
+        <w:t>Communication channels – Jamie</w:t>
+      </w:r>
+    </w:p>
+    <w:p>
+      <w:pPr>
+        <w:pStyle w:val="ListParagraph"/>
+        <w:spacing w:line="360" w:lineRule="auto"/>
+        <w:ind w:left="360"/>
+        <w:rPr>
+          <w:rFonts w:ascii="Times New Roman" w:hAnsi="Times New Roman" w:cs="Times New Roman"/>
+          <w:sz w:val="24"/>
+          <w:szCs w:val="24"/>
+          <w:lang w:val="en-GB"/>
+        </w:rPr>
+      </w:pPr>
+      <w:r>
+        <w:rPr>
+          <w:rFonts w:ascii="Times New Roman" w:hAnsi="Times New Roman" w:cs="Times New Roman"/>
+          <w:sz w:val="24"/>
+          <w:szCs w:val="24"/>
+          <w:lang w:val="en-GB"/>
+        </w:rPr>
+        <w:t>For this release I was unfortunately unable to complete the security for pubnub. Access manager is used for granting access to pubnub channels as a form of security. A user will need a cipher key if they wish to send or receive a message from a channel. Each time a user logins there will be a request sent to generate a token. This token will be used to determine what permissions to give the user, whether they can have read or write access or both. As the admin you will have full control over the permissions for users. These keys are also a secure way of ensuring that a user cannot give themselves unauthorised permissions such as admin access to the project. For our project these keys will be an excellent way of ensuring that no malicious data is sent to the hardware or to the database. It will also allow us to control the add, edit and remove drink functionalities for the barista’s to ensure that only they have access to changing the database for their companies. A regular user wouldn’t require access to these features for general use.</w:t>
       </w:r>
     </w:p>
     <w:p>
@@ -4143,33 +3526,7 @@
         <w:rPr>
           <w:color w:val="333333"/>
         </w:rPr>
-        <w:t xml:space="preserve">A large part of database security is having a backup running of the database. This can be easy to do using a MySQL database, however we are using a </w:t>
-      </w:r>
-      <w:r>
-        <w:rPr>
-          <w:color w:val="333333"/>
-        </w:rPr>
-        <w:t>NoSQL</w:t>
-      </w:r>
-      <w:r>
-        <w:rPr>
-          <w:color w:val="333333"/>
-        </w:rPr>
-        <w:t xml:space="preserve"> database therefore this was more difficult. The cluster I created for the project is under a free tier, within the free tier you cannot access the </w:t>
-      </w:r>
-      <w:proofErr w:type="gramStart"/>
-      <w:r>
-        <w:rPr>
-          <w:color w:val="333333"/>
-        </w:rPr>
-        <w:t>built in</w:t>
-      </w:r>
-      <w:proofErr w:type="gramEnd"/>
-      <w:r>
-        <w:rPr>
-          <w:color w:val="333333"/>
-        </w:rPr>
-        <w:t xml:space="preserve"> backup features of MongoDB Atlas. </w:t>
+        <w:t>A large part of database security is having a backup running of the database. This can be easy to do using a MySQL database, however we are using a NoSQL database therefore this was more difficult. The cluster I created for the project is under a free tier, within the free tier you cannot access the built in backup features of MongoDB Atlas. </w:t>
       </w:r>
     </w:p>
     <w:p>
@@ -4207,39 +3564,11 @@
           <w:color w:val="333333"/>
         </w:rPr>
       </w:pPr>
-      <w:proofErr w:type="gramStart"/>
       <w:r>
         <w:rPr>
           <w:color w:val="333333"/>
         </w:rPr>
-        <w:t>First of all</w:t>
-      </w:r>
-      <w:proofErr w:type="gramEnd"/>
-      <w:r>
-        <w:rPr>
-          <w:color w:val="333333"/>
-        </w:rPr>
-        <w:t>,</w:t>
-      </w:r>
-      <w:r>
-        <w:rPr>
-          <w:color w:val="333333"/>
-        </w:rPr>
-        <w:t xml:space="preserve"> I created a local backup of the database on my desktop. I did this by creating a folder called </w:t>
-      </w:r>
-      <w:proofErr w:type="spellStart"/>
-      <w:r>
-        <w:rPr>
-          <w:color w:val="333333"/>
-        </w:rPr>
-        <w:t>mongobackup</w:t>
-      </w:r>
-      <w:proofErr w:type="spellEnd"/>
-      <w:r>
-        <w:rPr>
-          <w:color w:val="333333"/>
-        </w:rPr>
-        <w:t>, in the terminal I went into this location and pasted in the export connection string from the MongoDB Atlas website. In the connection string I included my username and password for the admin user, as I have full access to the database. I also needed to edit the connection string by including the database name and the specified collection, I started with the drink status collection. </w:t>
+        <w:t>First of all, I created a local backup of the database on my desktop. I did this by creating a folder called mongobackup, in the terminal I went into this location and pasted in the export connection string from the MongoDB Atlas website. In the connection string I included my username and password for the admin user, as I have full access to the database. I also needed to edit the connection string by including the database name and the specified collection, I started with the drink status collection. </w:t>
       </w:r>
     </w:p>
     <w:p>
@@ -4280,8 +3609,9 @@
           <w:noProof/>
           <w:color w:val="333333"/>
         </w:rPr>
+        <w:lastRenderedPageBreak/>
         <w:drawing>
-          <wp:inline distT="0" distB="0" distL="0" distR="0" wp14:anchorId="32F64152" wp14:editId="5C297682">
+          <wp:inline distT="0" distB="0" distL="0" distR="0" wp14:anchorId="71AA5073" wp14:editId="2DDD2E4F">
             <wp:extent cx="5731510" cy="2482948"/>
             <wp:effectExtent l="0" t="0" r="2540" b="0"/>
             <wp:docPr id="676153796" name="Picture 1" descr="A screenshot of a computer&#10;&#10;Description automatically generated"/>
@@ -4337,102 +3667,7 @@
         <w:rPr>
           <w:color w:val="333333"/>
         </w:rPr>
-        <w:t xml:space="preserve">After adding in the connection string in the terminal, I was getting an error that mongo-export was not recognised. I researched how to get </w:t>
-      </w:r>
-      <w:r>
-        <w:rPr>
-          <w:color w:val="333333"/>
-        </w:rPr>
-        <w:t>mongo export</w:t>
-      </w:r>
-      <w:r>
-        <w:rPr>
-          <w:color w:val="333333"/>
-        </w:rPr>
-        <w:t xml:space="preserve"> installed in the terminal, and found </w:t>
-      </w:r>
-      <w:r>
-        <w:rPr>
-          <w:color w:val="333333"/>
-        </w:rPr>
-        <w:lastRenderedPageBreak/>
-        <w:t xml:space="preserve">I can download the </w:t>
-      </w:r>
-      <w:r>
-        <w:rPr>
-          <w:color w:val="333333"/>
-        </w:rPr>
-        <w:t>MongoDB</w:t>
-      </w:r>
-      <w:r>
-        <w:rPr>
-          <w:color w:val="333333"/>
-        </w:rPr>
-        <w:t xml:space="preserve"> tools from the mongo website. I downloaded the tools </w:t>
-      </w:r>
-      <w:proofErr w:type="gramStart"/>
-      <w:r>
-        <w:rPr>
-          <w:color w:val="333333"/>
-        </w:rPr>
-        <w:t>into  my</w:t>
-      </w:r>
-      <w:proofErr w:type="gramEnd"/>
-      <w:r>
-        <w:rPr>
-          <w:color w:val="333333"/>
-        </w:rPr>
-        <w:t xml:space="preserve"> program files and created a path in the environment variables to the mongo tools. Once I did this the </w:t>
-      </w:r>
-      <w:r>
-        <w:rPr>
-          <w:color w:val="333333"/>
-        </w:rPr>
-        <w:t>mongo export</w:t>
-      </w:r>
-      <w:r>
-        <w:rPr>
-          <w:color w:val="333333"/>
-        </w:rPr>
-        <w:t xml:space="preserve"> command was recognised and I was connected, the </w:t>
-      </w:r>
-      <w:r>
-        <w:rPr>
-          <w:color w:val="333333"/>
-        </w:rPr>
-        <w:t>drink status</w:t>
-      </w:r>
-      <w:r>
-        <w:rPr>
-          <w:color w:val="333333"/>
-        </w:rPr>
-        <w:t xml:space="preserve"> records were coming </w:t>
-      </w:r>
-      <w:r>
-        <w:rPr>
-          <w:color w:val="333333"/>
-        </w:rPr>
-        <w:t>into</w:t>
-      </w:r>
-      <w:r>
-        <w:rPr>
-          <w:color w:val="333333"/>
-        </w:rPr>
-        <w:t xml:space="preserve"> the local </w:t>
-      </w:r>
-      <w:proofErr w:type="spellStart"/>
-      <w:r>
-        <w:rPr>
-          <w:color w:val="333333"/>
-        </w:rPr>
-        <w:t>mongobackup</w:t>
-      </w:r>
-      <w:proofErr w:type="spellEnd"/>
-      <w:r>
-        <w:rPr>
-          <w:color w:val="333333"/>
-        </w:rPr>
-        <w:t xml:space="preserve"> folder. I repeated this process for my other collections drinks and notifications. </w:t>
+        <w:t>After adding in the connection string in the terminal, I was getting an error that mongo-export was not recognised. I researched how to get mongo export installed in the terminal, and found I can download the MongoDB tools from the mongo website. I downloaded the tools into  my program files and created a path in the environment variables to the mongo tools. Once I did this the mongo export command was recognised and I was connected, the drink status records were coming into the local mongobackup folder. I repeated this process for my other collections drinks and notifications. </w:t>
       </w:r>
     </w:p>
     <w:p>
@@ -4448,21 +3683,7 @@
         <w:rPr>
           <w:color w:val="333333"/>
         </w:rPr>
-        <w:t xml:space="preserve">Once I was able to connect to atlas and create a local backup, I started the process of creating a backup on the AWS instance using a </w:t>
-      </w:r>
-      <w:proofErr w:type="spellStart"/>
-      <w:r>
-        <w:rPr>
-          <w:color w:val="333333"/>
-        </w:rPr>
-        <w:t>cron</w:t>
-      </w:r>
-      <w:proofErr w:type="spellEnd"/>
-      <w:r>
-        <w:rPr>
-          <w:color w:val="333333"/>
-        </w:rPr>
-        <w:t xml:space="preserve"> job. To do this first I created the script file called mongobackup.sh.</w:t>
+        <w:t>Once I was able to connect to atlas and create a local backup, I started the process of creating a backup on the AWS instance using a cron job. To do this first I created the script file called mongobackup.sh.</w:t>
       </w:r>
     </w:p>
     <w:p>
@@ -4488,7 +3709,7 @@
           <w:lang w:val="en-GB"/>
         </w:rPr>
         <w:drawing>
-          <wp:anchor distT="0" distB="0" distL="114300" distR="114300" simplePos="0" relativeHeight="251660288" behindDoc="0" locked="0" layoutInCell="1" allowOverlap="1" wp14:anchorId="103325C9" wp14:editId="3C48FCCE">
+          <wp:anchor distT="0" distB="0" distL="114300" distR="114300" simplePos="0" relativeHeight="251660288" behindDoc="0" locked="0" layoutInCell="1" allowOverlap="1" wp14:anchorId="19466125" wp14:editId="657D184A">
             <wp:simplePos x="0" y="0"/>
             <wp:positionH relativeFrom="margin">
               <wp:align>center</wp:align>
@@ -4499,7 +3720,7 @@
             <wp:extent cx="6822440" cy="1919605"/>
             <wp:effectExtent l="0" t="0" r="0" b="4445"/>
             <wp:wrapSquare wrapText="bothSides"/>
-            <wp:docPr id="502413451" name="Picture 3"/>
+            <wp:docPr id="502413451" name="Picture 3" descr="A screenshot of a computer&#10;&#10;Description automatically generated"/>
             <wp:cNvGraphicFramePr>
               <a:graphicFrameLocks xmlns:a="http://schemas.openxmlformats.org/drawingml/2006/main" noChangeAspect="1"/>
             </wp:cNvGraphicFramePr>
@@ -4507,7 +3728,7 @@
               <a:graphicData uri="http://schemas.openxmlformats.org/drawingml/2006/picture">
                 <pic:pic xmlns:pic="http://schemas.openxmlformats.org/drawingml/2006/picture">
                   <pic:nvPicPr>
-                    <pic:cNvPr id="0" name="Picture 2"/>
+                    <pic:cNvPr id="502413451" name="Picture 3" descr="A screenshot of a computer&#10;&#10;Description automatically generated"/>
                     <pic:cNvPicPr>
                       <a:picLocks noChangeAspect="1" noChangeArrowheads="1"/>
                     </pic:cNvPicPr>
@@ -4582,90 +3803,42 @@
           <w:szCs w:val="24"/>
           <w:lang w:val="en-GB"/>
         </w:rPr>
-        <w:t>Next,</w:t>
-      </w:r>
-      <w:r>
-        <w:rPr>
-          <w:rFonts w:ascii="Times New Roman" w:hAnsi="Times New Roman" w:cs="Times New Roman"/>
-          <w:sz w:val="24"/>
-          <w:szCs w:val="24"/>
-          <w:lang w:val="en-GB"/>
-        </w:rPr>
-        <w:t xml:space="preserve"> I ran the script file to ensure it was connecting properly to atlas, then I moved on to creating the </w:t>
-      </w:r>
-      <w:proofErr w:type="spellStart"/>
-      <w:r>
-        <w:rPr>
-          <w:rFonts w:ascii="Times New Roman" w:hAnsi="Times New Roman" w:cs="Times New Roman"/>
-          <w:sz w:val="24"/>
-          <w:szCs w:val="24"/>
-          <w:lang w:val="en-GB"/>
-        </w:rPr>
-        <w:t>cron</w:t>
-      </w:r>
-      <w:proofErr w:type="spellEnd"/>
-      <w:r>
-        <w:rPr>
-          <w:rFonts w:ascii="Times New Roman" w:hAnsi="Times New Roman" w:cs="Times New Roman"/>
-          <w:sz w:val="24"/>
-          <w:szCs w:val="24"/>
-          <w:lang w:val="en-GB"/>
-        </w:rPr>
-        <w:t xml:space="preserve"> job. To test that the </w:t>
-      </w:r>
-      <w:proofErr w:type="spellStart"/>
-      <w:r>
-        <w:rPr>
-          <w:rFonts w:ascii="Times New Roman" w:hAnsi="Times New Roman" w:cs="Times New Roman"/>
-          <w:sz w:val="24"/>
-          <w:szCs w:val="24"/>
-          <w:lang w:val="en-GB"/>
-        </w:rPr>
-        <w:t>cron</w:t>
-      </w:r>
-      <w:proofErr w:type="spellEnd"/>
-      <w:r>
-        <w:rPr>
-          <w:rFonts w:ascii="Times New Roman" w:hAnsi="Times New Roman" w:cs="Times New Roman"/>
-          <w:sz w:val="24"/>
-          <w:szCs w:val="24"/>
-          <w:lang w:val="en-GB"/>
-        </w:rPr>
-        <w:t xml:space="preserve"> was running as it should, I set it to run every minute. </w:t>
-      </w:r>
-    </w:p>
-    <w:p>
-      <w:pPr>
-        <w:spacing w:line="360" w:lineRule="auto"/>
-        <w:rPr>
-          <w:rFonts w:ascii="Times New Roman" w:hAnsi="Times New Roman" w:cs="Times New Roman"/>
-          <w:sz w:val="24"/>
-          <w:szCs w:val="24"/>
-          <w:lang w:val="en-GB"/>
-        </w:rPr>
-      </w:pPr>
-    </w:p>
-    <w:p>
-      <w:pPr>
-        <w:spacing w:line="360" w:lineRule="auto"/>
-        <w:rPr>
-          <w:rFonts w:ascii="Times New Roman" w:hAnsi="Times New Roman" w:cs="Times New Roman"/>
-          <w:b/>
-          <w:bCs/>
-          <w:sz w:val="24"/>
-          <w:szCs w:val="24"/>
-          <w:lang w:val="en-GB"/>
-        </w:rPr>
-      </w:pPr>
-      <w:r>
-        <w:rPr>
-          <w:rFonts w:ascii="Times New Roman" w:hAnsi="Times New Roman" w:cs="Times New Roman"/>
-          <w:b/>
-          <w:bCs/>
-          <w:sz w:val="24"/>
-          <w:szCs w:val="24"/>
-          <w:lang w:val="en-GB"/>
-        </w:rPr>
+        <w:t>Next, I ran the script file to ensure it was connecting properly to atlas, then I moved on to creating the cron job. To test that the cron was running as it should, I set it to run every minute. </w:t>
+      </w:r>
+    </w:p>
+    <w:p>
+      <w:pPr>
+        <w:spacing w:line="360" w:lineRule="auto"/>
+        <w:rPr>
+          <w:rFonts w:ascii="Times New Roman" w:hAnsi="Times New Roman" w:cs="Times New Roman"/>
+          <w:sz w:val="24"/>
+          <w:szCs w:val="24"/>
+          <w:lang w:val="en-GB"/>
+        </w:rPr>
+      </w:pPr>
+    </w:p>
+    <w:p>
+      <w:pPr>
+        <w:spacing w:line="360" w:lineRule="auto"/>
+        <w:rPr>
+          <w:rFonts w:ascii="Times New Roman" w:hAnsi="Times New Roman" w:cs="Times New Roman"/>
+          <w:b/>
+          <w:bCs/>
+          <w:sz w:val="24"/>
+          <w:szCs w:val="24"/>
+          <w:lang w:val="en-GB"/>
+        </w:rPr>
+      </w:pPr>
+      <w:r>
+        <w:rPr>
+          <w:rFonts w:ascii="Times New Roman" w:hAnsi="Times New Roman" w:cs="Times New Roman"/>
+          <w:b/>
+          <w:bCs/>
+          <w:sz w:val="24"/>
+          <w:szCs w:val="24"/>
+          <w:lang w:val="en-GB"/>
+        </w:rPr>
+        <w:lastRenderedPageBreak/>
         <w:t>Cron:</w:t>
       </w:r>
     </w:p>
@@ -4692,7 +3865,7 @@
           <w:lang w:val="en-GB"/>
         </w:rPr>
         <w:drawing>
-          <wp:inline distT="0" distB="0" distL="0" distR="0" wp14:anchorId="0100AC67" wp14:editId="17B93C52">
+          <wp:inline distT="0" distB="0" distL="0" distR="0" wp14:anchorId="56F72919" wp14:editId="62F07DB2">
             <wp:extent cx="5247005" cy="2433711"/>
             <wp:effectExtent l="0" t="0" r="0" b="5080"/>
             <wp:docPr id="2108254088" name="Picture 6" descr="A screen shot of a computer&#10;&#10;Description automatically generated"/>
@@ -4762,7 +3935,6 @@
           <w:szCs w:val="24"/>
           <w:lang w:val="en-GB"/>
         </w:rPr>
-        <w:lastRenderedPageBreak/>
         <w:t>Log:</w:t>
       </w:r>
     </w:p>
@@ -4783,27 +3955,7 @@
           <w:szCs w:val="24"/>
           <w:lang w:val="en-GB"/>
         </w:rPr>
-        <w:t xml:space="preserve">To check the backup was running correctly I ran a command to view the </w:t>
-      </w:r>
-      <w:proofErr w:type="spellStart"/>
-      <w:r>
-        <w:rPr>
-          <w:rFonts w:ascii="Times New Roman" w:hAnsi="Times New Roman" w:cs="Times New Roman"/>
-          <w:sz w:val="24"/>
-          <w:szCs w:val="24"/>
-          <w:lang w:val="en-GB"/>
-        </w:rPr>
-        <w:t>syslogs</w:t>
-      </w:r>
-      <w:proofErr w:type="spellEnd"/>
-      <w:r>
-        <w:rPr>
-          <w:rFonts w:ascii="Times New Roman" w:hAnsi="Times New Roman" w:cs="Times New Roman"/>
-          <w:sz w:val="24"/>
-          <w:szCs w:val="24"/>
-          <w:lang w:val="en-GB"/>
-        </w:rPr>
-        <w:t>.</w:t>
+        <w:t>To check the backup was running correctly I ran a command to view the syslogs.</w:t>
       </w:r>
     </w:p>
     <w:p>
@@ -4829,7 +3981,7 @@
           <w:lang w:val="en-GB"/>
         </w:rPr>
         <w:drawing>
-          <wp:inline distT="0" distB="0" distL="0" distR="0" wp14:anchorId="05D05A7D" wp14:editId="492C3AB9">
+          <wp:inline distT="0" distB="0" distL="0" distR="0" wp14:anchorId="3F12F8CB" wp14:editId="68B60D63">
             <wp:extent cx="5823456" cy="3742006"/>
             <wp:effectExtent l="0" t="0" r="6350" b="0"/>
             <wp:docPr id="297876184" name="Picture 7" descr="A screen shot of a computer&#10;&#10;Description automatically generated"/>
@@ -4895,65 +4047,7 @@
           <w:szCs w:val="24"/>
           <w:lang w:val="en-GB"/>
         </w:rPr>
-        <w:t xml:space="preserve"> From the logs we can see the cronjob is running every minute as it should, now to check that the correct contents </w:t>
-      </w:r>
-      <w:r>
-        <w:rPr>
-          <w:rFonts w:ascii="Times New Roman" w:hAnsi="Times New Roman" w:cs="Times New Roman"/>
-          <w:sz w:val="24"/>
-          <w:szCs w:val="24"/>
-          <w:lang w:val="en-GB"/>
-        </w:rPr>
-        <w:t>have</w:t>
-      </w:r>
-      <w:r>
-        <w:rPr>
-          <w:rFonts w:ascii="Times New Roman" w:hAnsi="Times New Roman" w:cs="Times New Roman"/>
-          <w:sz w:val="24"/>
-          <w:szCs w:val="24"/>
-          <w:lang w:val="en-GB"/>
-        </w:rPr>
-        <w:t xml:space="preserve"> come </w:t>
-      </w:r>
-      <w:proofErr w:type="gramStart"/>
-      <w:r>
-        <w:rPr>
-          <w:rFonts w:ascii="Times New Roman" w:hAnsi="Times New Roman" w:cs="Times New Roman"/>
-          <w:sz w:val="24"/>
-          <w:szCs w:val="24"/>
-          <w:lang w:val="en-GB"/>
-        </w:rPr>
-        <w:t>in to</w:t>
-      </w:r>
-      <w:proofErr w:type="gramEnd"/>
-      <w:r>
-        <w:rPr>
-          <w:rFonts w:ascii="Times New Roman" w:hAnsi="Times New Roman" w:cs="Times New Roman"/>
-          <w:sz w:val="24"/>
-          <w:szCs w:val="24"/>
-          <w:lang w:val="en-GB"/>
-        </w:rPr>
-        <w:t xml:space="preserve"> the </w:t>
-      </w:r>
-      <w:proofErr w:type="spellStart"/>
-      <w:r>
-        <w:rPr>
-          <w:rFonts w:ascii="Times New Roman" w:hAnsi="Times New Roman" w:cs="Times New Roman"/>
-          <w:sz w:val="24"/>
-          <w:szCs w:val="24"/>
-          <w:lang w:val="en-GB"/>
-        </w:rPr>
-        <w:t>mongobackup</w:t>
-      </w:r>
-      <w:proofErr w:type="spellEnd"/>
-      <w:r>
-        <w:rPr>
-          <w:rFonts w:ascii="Times New Roman" w:hAnsi="Times New Roman" w:cs="Times New Roman"/>
-          <w:sz w:val="24"/>
-          <w:szCs w:val="24"/>
-          <w:lang w:val="en-GB"/>
-        </w:rPr>
-        <w:t xml:space="preserve"> folder. </w:t>
+        <w:t> From the logs we can see the cronjob is running every minute as it should, now to check that the correct contents have come in to the mongobackup folder. </w:t>
       </w:r>
     </w:p>
     <w:p>
@@ -4969,29 +4063,16 @@
           <w:lang w:val="en-GB"/>
         </w:rPr>
       </w:pPr>
-      <w:proofErr w:type="spellStart"/>
-      <w:r>
-        <w:rPr>
-          <w:rFonts w:ascii="Times New Roman" w:hAnsi="Times New Roman" w:cs="Times New Roman"/>
-          <w:b/>
-          <w:bCs/>
-          <w:sz w:val="24"/>
-          <w:szCs w:val="24"/>
-          <w:lang w:val="en-GB"/>
-        </w:rPr>
-        <w:t>Mongobackup</w:t>
-      </w:r>
-      <w:proofErr w:type="spellEnd"/>
-      <w:r>
-        <w:rPr>
-          <w:rFonts w:ascii="Times New Roman" w:hAnsi="Times New Roman" w:cs="Times New Roman"/>
-          <w:b/>
-          <w:bCs/>
-          <w:sz w:val="24"/>
-          <w:szCs w:val="24"/>
-          <w:lang w:val="en-GB"/>
-        </w:rPr>
-        <w:t xml:space="preserve"> Folder:</w:t>
+      <w:r>
+        <w:rPr>
+          <w:rFonts w:ascii="Times New Roman" w:hAnsi="Times New Roman" w:cs="Times New Roman"/>
+          <w:b/>
+          <w:bCs/>
+          <w:sz w:val="24"/>
+          <w:szCs w:val="24"/>
+          <w:lang w:val="en-GB"/>
+        </w:rPr>
+        <w:t>Mongobackup Folder:</w:t>
       </w:r>
     </w:p>
     <w:p>
@@ -5015,8 +4096,9 @@
           <w:u w:val="single"/>
           <w:lang w:val="en-GB"/>
         </w:rPr>
+        <w:lastRenderedPageBreak/>
         <w:drawing>
-          <wp:inline distT="0" distB="0" distL="0" distR="0" wp14:anchorId="5D076692" wp14:editId="6CA7F6BC">
+          <wp:inline distT="0" distB="0" distL="0" distR="0" wp14:anchorId="76DF2099" wp14:editId="68F28A43">
             <wp:extent cx="5731510" cy="946150"/>
             <wp:effectExtent l="0" t="0" r="2540" b="6350"/>
             <wp:docPr id="649836989" name="Picture 8" descr="A screen shot of a computer&#10;&#10;Description automatically generated"/>
@@ -5076,45 +4158,7 @@
           <w:szCs w:val="24"/>
           <w:lang w:val="en-GB"/>
         </w:rPr>
-        <w:t xml:space="preserve">A copy of each of the files has been added the </w:t>
-      </w:r>
-      <w:r>
-        <w:rPr>
-          <w:rFonts w:ascii="Times New Roman" w:hAnsi="Times New Roman" w:cs="Times New Roman"/>
-          <w:sz w:val="24"/>
-          <w:szCs w:val="24"/>
-          <w:lang w:val="en-GB"/>
-        </w:rPr>
-        <w:t xml:space="preserve">drink </w:t>
-      </w:r>
-      <w:proofErr w:type="gramStart"/>
-      <w:r>
-        <w:rPr>
-          <w:rFonts w:ascii="Times New Roman" w:hAnsi="Times New Roman" w:cs="Times New Roman"/>
-          <w:sz w:val="24"/>
-          <w:szCs w:val="24"/>
-          <w:lang w:val="en-GB"/>
-        </w:rPr>
-        <w:t>status</w:t>
-      </w:r>
-      <w:r>
-        <w:rPr>
-          <w:rFonts w:ascii="Times New Roman" w:hAnsi="Times New Roman" w:cs="Times New Roman"/>
-          <w:sz w:val="24"/>
-          <w:szCs w:val="24"/>
-          <w:lang w:val="en-GB"/>
-        </w:rPr>
-        <w:t xml:space="preserve"> ,</w:t>
-      </w:r>
-      <w:proofErr w:type="gramEnd"/>
-      <w:r>
-        <w:rPr>
-          <w:rFonts w:ascii="Times New Roman" w:hAnsi="Times New Roman" w:cs="Times New Roman"/>
-          <w:sz w:val="24"/>
-          <w:szCs w:val="24"/>
-          <w:lang w:val="en-GB"/>
-        </w:rPr>
-        <w:t xml:space="preserve"> drinks and notifications all for each of the collections in the database.</w:t>
+        <w:t>A copy of each of the files has been added the drink status , drinks and notifications all for each of the collections in the database.</w:t>
       </w:r>
     </w:p>
     <w:p>
@@ -5163,9 +4207,8 @@
           <w:szCs w:val="24"/>
           <w:lang w:val="en-GB"/>
         </w:rPr>
-        <w:lastRenderedPageBreak/>
         <w:drawing>
-          <wp:inline distT="0" distB="0" distL="0" distR="0" wp14:anchorId="71332BCB" wp14:editId="0D597E2C">
+          <wp:inline distT="0" distB="0" distL="0" distR="0" wp14:anchorId="3BAF0FC5" wp14:editId="45FCD3D4">
             <wp:extent cx="5064125" cy="3418449"/>
             <wp:effectExtent l="0" t="0" r="3175" b="0"/>
             <wp:docPr id="2004093157" name="Picture 9" descr="A screenshot of a computer&#10;&#10;Description automatically generated"/>
@@ -5363,6 +4406,7 @@
           <w:u w:val="single"/>
           <w:lang w:val="en-GB"/>
         </w:rPr>
+        <w:lastRenderedPageBreak/>
         <w:t>Drink Status JSON:</w:t>
       </w:r>
     </w:p>
@@ -5390,9 +4434,8 @@
           <w:u w:val="single"/>
           <w:lang w:val="en-GB"/>
         </w:rPr>
-        <w:lastRenderedPageBreak/>
         <w:drawing>
-          <wp:inline distT="0" distB="0" distL="0" distR="0" wp14:anchorId="17D1F2D4" wp14:editId="7A19C1C9">
+          <wp:inline distT="0" distB="0" distL="0" distR="0" wp14:anchorId="0F574F00" wp14:editId="5ACF95E3">
             <wp:extent cx="6055848" cy="3379307"/>
             <wp:effectExtent l="0" t="0" r="2540" b="0"/>
             <wp:docPr id="1447446300" name="Picture 10" descr="A screen shot of a computer screen&#10;&#10;Description automatically generated"/>
@@ -5451,38 +4494,7 @@
           <w:szCs w:val="24"/>
           <w:lang w:val="en-GB"/>
         </w:rPr>
-        <w:t xml:space="preserve"> By comparing the records from the drink status collection in MongoDB Atlas and in the backup </w:t>
-      </w:r>
-      <w:proofErr w:type="spellStart"/>
-      <w:r>
-        <w:rPr>
-          <w:rFonts w:ascii="Times New Roman" w:hAnsi="Times New Roman" w:cs="Times New Roman"/>
-          <w:sz w:val="24"/>
-          <w:szCs w:val="24"/>
-          <w:lang w:val="en-GB"/>
-        </w:rPr>
-        <w:t>drink_</w:t>
-      </w:r>
-      <w:proofErr w:type="gramStart"/>
-      <w:r>
-        <w:rPr>
-          <w:rFonts w:ascii="Times New Roman" w:hAnsi="Times New Roman" w:cs="Times New Roman"/>
-          <w:sz w:val="24"/>
-          <w:szCs w:val="24"/>
-          <w:lang w:val="en-GB"/>
-        </w:rPr>
-        <w:t>status.json</w:t>
-      </w:r>
-      <w:proofErr w:type="spellEnd"/>
-      <w:proofErr w:type="gramEnd"/>
-      <w:r>
-        <w:rPr>
-          <w:rFonts w:ascii="Times New Roman" w:hAnsi="Times New Roman" w:cs="Times New Roman"/>
-          <w:sz w:val="24"/>
-          <w:szCs w:val="24"/>
-          <w:lang w:val="en-GB"/>
-        </w:rPr>
-        <w:t>, we can see that the records have come in correctly . There are 17 records in the database and 17 values in the Json. </w:t>
+        <w:t> By comparing the records from the drink status collection in MongoDB Atlas and in the backup drink_status.json, we can see that the records have come in correctly . There are 17 records in the database and 17 values in the Json. </w:t>
       </w:r>
     </w:p>
     <w:p>
@@ -5552,7 +4564,7 @@
           <w:lang w:val="en-GB"/>
         </w:rPr>
         <w:drawing>
-          <wp:inline distT="0" distB="0" distL="0" distR="0" wp14:anchorId="38358F1E" wp14:editId="0E5C3D9A">
+          <wp:inline distT="0" distB="0" distL="0" distR="0" wp14:anchorId="42E08B7C" wp14:editId="3B53E99E">
             <wp:extent cx="3059723" cy="2302510"/>
             <wp:effectExtent l="0" t="0" r="7620" b="2540"/>
             <wp:docPr id="829991585" name="Picture 11" descr="A screenshot of a computer&#10;&#10;Description automatically generated"/>
@@ -5618,27 +4630,8 @@
           <w:szCs w:val="24"/>
           <w:lang w:val="en-GB"/>
         </w:rPr>
-        <w:t xml:space="preserve">A new record with the drink type Mocha has been added to the drink status collection, now we wait one minute to ensure the record is added to the next backup of the database in the server using the </w:t>
-      </w:r>
-      <w:proofErr w:type="spellStart"/>
-      <w:r>
-        <w:rPr>
-          <w:rFonts w:ascii="Times New Roman" w:hAnsi="Times New Roman" w:cs="Times New Roman"/>
-          <w:sz w:val="24"/>
-          <w:szCs w:val="24"/>
-          <w:lang w:val="en-GB"/>
-        </w:rPr>
-        <w:t>cron</w:t>
-      </w:r>
-      <w:proofErr w:type="spellEnd"/>
-      <w:r>
-        <w:rPr>
-          <w:rFonts w:ascii="Times New Roman" w:hAnsi="Times New Roman" w:cs="Times New Roman"/>
-          <w:sz w:val="24"/>
-          <w:szCs w:val="24"/>
-          <w:lang w:val="en-GB"/>
-        </w:rPr>
-        <w:t xml:space="preserve"> job.</w:t>
+        <w:lastRenderedPageBreak/>
+        <w:t>A new record with the drink type Mocha has been added to the drink status collection, now we wait one minute to ensure the record is added to the next backup of the database in the server using the cron job.</w:t>
       </w:r>
     </w:p>
     <w:p>
@@ -5659,9 +4652,8 @@
           <w:szCs w:val="24"/>
           <w:lang w:val="en-GB"/>
         </w:rPr>
-        <w:lastRenderedPageBreak/>
         <w:drawing>
-          <wp:inline distT="0" distB="0" distL="0" distR="0" wp14:anchorId="51415D8B" wp14:editId="6B7B5A25">
+          <wp:inline distT="0" distB="0" distL="0" distR="0" wp14:anchorId="1D361683" wp14:editId="3F0A5756">
             <wp:extent cx="5731510" cy="970671"/>
             <wp:effectExtent l="0" t="0" r="2540" b="1270"/>
             <wp:docPr id="1771758978" name="Picture 12" descr="A screen shot of a black screen&#10;&#10;Description automatically generated"/>
@@ -5766,7 +4758,7 @@
           <w:lang w:val="en-GB"/>
         </w:rPr>
         <w:drawing>
-          <wp:inline distT="0" distB="0" distL="0" distR="0" wp14:anchorId="3DED55BC" wp14:editId="7ABE85A3">
+          <wp:inline distT="0" distB="0" distL="0" distR="0" wp14:anchorId="0AC55D7B" wp14:editId="74BEE7CD">
             <wp:extent cx="6042074" cy="3360420"/>
             <wp:effectExtent l="0" t="0" r="0" b="0"/>
             <wp:docPr id="1436355825" name="Picture 13" descr="A screen shot of a computer&#10;&#10;Description automatically generated"/>
@@ -5825,67 +4817,27 @@
           <w:szCs w:val="24"/>
           <w:lang w:val="en-GB"/>
         </w:rPr>
-        <w:t xml:space="preserve">The bottom record shows that the new drink "Mocha" has been added into the back up of the database, using </w:t>
-      </w:r>
-      <w:proofErr w:type="spellStart"/>
-      <w:r>
-        <w:rPr>
-          <w:rFonts w:ascii="Times New Roman" w:hAnsi="Times New Roman" w:cs="Times New Roman"/>
-          <w:sz w:val="24"/>
-          <w:szCs w:val="24"/>
-          <w:lang w:val="en-GB"/>
-        </w:rPr>
-        <w:t>cron</w:t>
-      </w:r>
-      <w:proofErr w:type="spellEnd"/>
-      <w:r>
-        <w:rPr>
-          <w:rFonts w:ascii="Times New Roman" w:hAnsi="Times New Roman" w:cs="Times New Roman"/>
-          <w:sz w:val="24"/>
-          <w:szCs w:val="24"/>
-          <w:lang w:val="en-GB"/>
-        </w:rPr>
-        <w:t>. </w:t>
-      </w:r>
-    </w:p>
-    <w:p>
-      <w:pPr>
-        <w:spacing w:line="360" w:lineRule="auto"/>
-        <w:rPr>
-          <w:rFonts w:ascii="Times New Roman" w:hAnsi="Times New Roman" w:cs="Times New Roman"/>
-          <w:sz w:val="24"/>
-          <w:szCs w:val="24"/>
-          <w:lang w:val="en-GB"/>
-        </w:rPr>
-      </w:pPr>
-      <w:r>
-        <w:rPr>
-          <w:rFonts w:ascii="Times New Roman" w:hAnsi="Times New Roman" w:cs="Times New Roman"/>
-          <w:sz w:val="24"/>
-          <w:szCs w:val="24"/>
-          <w:lang w:val="en-GB"/>
-        </w:rPr>
-        <w:t xml:space="preserve">As we are not dealing with a large set of data, I think an appropriate number of backups would be once a week. I have changed the </w:t>
-      </w:r>
-      <w:proofErr w:type="spellStart"/>
-      <w:r>
-        <w:rPr>
-          <w:rFonts w:ascii="Times New Roman" w:hAnsi="Times New Roman" w:cs="Times New Roman"/>
-          <w:sz w:val="24"/>
-          <w:szCs w:val="24"/>
-          <w:lang w:val="en-GB"/>
-        </w:rPr>
-        <w:t>cron</w:t>
-      </w:r>
-      <w:proofErr w:type="spellEnd"/>
-      <w:r>
-        <w:rPr>
-          <w:rFonts w:ascii="Times New Roman" w:hAnsi="Times New Roman" w:cs="Times New Roman"/>
-          <w:sz w:val="24"/>
-          <w:szCs w:val="24"/>
-          <w:lang w:val="en-GB"/>
-        </w:rPr>
-        <w:t xml:space="preserve"> job to run every Friday at 12am as shown below.</w:t>
+        <w:t>The bottom record shows that the new drink "Mocha" has been added into the back up of the database, using cron. </w:t>
+      </w:r>
+    </w:p>
+    <w:p>
+      <w:pPr>
+        <w:spacing w:line="360" w:lineRule="auto"/>
+        <w:rPr>
+          <w:rFonts w:ascii="Times New Roman" w:hAnsi="Times New Roman" w:cs="Times New Roman"/>
+          <w:sz w:val="24"/>
+          <w:szCs w:val="24"/>
+          <w:lang w:val="en-GB"/>
+        </w:rPr>
+      </w:pPr>
+      <w:r>
+        <w:rPr>
+          <w:rFonts w:ascii="Times New Roman" w:hAnsi="Times New Roman" w:cs="Times New Roman"/>
+          <w:sz w:val="24"/>
+          <w:szCs w:val="24"/>
+          <w:lang w:val="en-GB"/>
+        </w:rPr>
+        <w:t>As we are not dealing with a large set of data, I think an appropriate number of backups would be once a week. I have changed the cron job to run every Friday at 12am as shown below.</w:t>
       </w:r>
     </w:p>
     <w:p>
@@ -5935,7 +4887,7 @@
           <w:lang w:val="en-GB"/>
         </w:rPr>
         <w:drawing>
-          <wp:inline distT="0" distB="0" distL="0" distR="0" wp14:anchorId="738CC674" wp14:editId="7AA64939">
+          <wp:inline distT="0" distB="0" distL="0" distR="0" wp14:anchorId="2146FE7E" wp14:editId="3B9DEA9C">
             <wp:extent cx="4993640" cy="3143314"/>
             <wp:effectExtent l="0" t="0" r="0" b="0"/>
             <wp:docPr id="1551338893" name="Picture 14" descr="A screenshot of a computer&#10;&#10;Description automatically generated"/>
@@ -6022,107 +4974,27 @@
           <w:szCs w:val="24"/>
           <w:lang w:val="en-GB"/>
         </w:rPr>
-        <w:t xml:space="preserve"> to learn how to use </w:t>
-      </w:r>
-      <w:proofErr w:type="spellStart"/>
-      <w:r>
-        <w:rPr>
-          <w:rFonts w:ascii="Times New Roman" w:hAnsi="Times New Roman" w:cs="Times New Roman"/>
-          <w:sz w:val="24"/>
-          <w:szCs w:val="24"/>
-          <w:lang w:val="en-GB"/>
-        </w:rPr>
-        <w:t>cron</w:t>
-      </w:r>
-      <w:proofErr w:type="spellEnd"/>
-      <w:r>
-        <w:rPr>
-          <w:rFonts w:ascii="Times New Roman" w:hAnsi="Times New Roman" w:cs="Times New Roman"/>
-          <w:sz w:val="24"/>
-          <w:szCs w:val="24"/>
-          <w:lang w:val="en-GB"/>
-        </w:rPr>
-        <w:t xml:space="preserve">, in the code above a Sudo command will be run on the script file that I created. The script file includes each of the mongo export connection strings to the collections. Without calling the </w:t>
-      </w:r>
-      <w:proofErr w:type="spellStart"/>
-      <w:r>
-        <w:rPr>
-          <w:rFonts w:ascii="Times New Roman" w:hAnsi="Times New Roman" w:cs="Times New Roman"/>
-          <w:sz w:val="24"/>
-          <w:szCs w:val="24"/>
-          <w:lang w:val="en-GB"/>
-        </w:rPr>
-        <w:t>sudo</w:t>
-      </w:r>
-      <w:proofErr w:type="spellEnd"/>
-      <w:r>
-        <w:rPr>
-          <w:rFonts w:ascii="Times New Roman" w:hAnsi="Times New Roman" w:cs="Times New Roman"/>
-          <w:sz w:val="24"/>
-          <w:szCs w:val="24"/>
-          <w:lang w:val="en-GB"/>
-        </w:rPr>
-        <w:t xml:space="preserve"> command on the script file, the </w:t>
-      </w:r>
-      <w:proofErr w:type="spellStart"/>
-      <w:r>
-        <w:rPr>
-          <w:rFonts w:ascii="Times New Roman" w:hAnsi="Times New Roman" w:cs="Times New Roman"/>
-          <w:sz w:val="24"/>
-          <w:szCs w:val="24"/>
-          <w:lang w:val="en-GB"/>
-        </w:rPr>
-        <w:t>cron</w:t>
-      </w:r>
-      <w:proofErr w:type="spellEnd"/>
-      <w:r>
-        <w:rPr>
-          <w:rFonts w:ascii="Times New Roman" w:hAnsi="Times New Roman" w:cs="Times New Roman"/>
-          <w:sz w:val="24"/>
-          <w:szCs w:val="24"/>
-          <w:lang w:val="en-GB"/>
-        </w:rPr>
-        <w:t xml:space="preserve"> job was not running correctly, and the records were not coming in. </w:t>
-      </w:r>
-    </w:p>
-    <w:p>
-      <w:pPr>
-        <w:spacing w:line="360" w:lineRule="auto"/>
-        <w:rPr>
-          <w:rFonts w:ascii="Times New Roman" w:hAnsi="Times New Roman" w:cs="Times New Roman"/>
-          <w:sz w:val="24"/>
-          <w:szCs w:val="24"/>
-          <w:lang w:val="en-GB"/>
-        </w:rPr>
-      </w:pPr>
-      <w:r>
-        <w:rPr>
-          <w:rFonts w:ascii="Times New Roman" w:hAnsi="Times New Roman" w:cs="Times New Roman"/>
-          <w:sz w:val="24"/>
-          <w:szCs w:val="24"/>
-          <w:lang w:val="en-GB"/>
-        </w:rPr>
-        <w:t xml:space="preserve">For our database security we now have both a local backup and a backup running on a </w:t>
-      </w:r>
-      <w:proofErr w:type="spellStart"/>
-      <w:r>
-        <w:rPr>
-          <w:rFonts w:ascii="Times New Roman" w:hAnsi="Times New Roman" w:cs="Times New Roman"/>
-          <w:sz w:val="24"/>
-          <w:szCs w:val="24"/>
-          <w:lang w:val="en-GB"/>
-        </w:rPr>
-        <w:t>cron</w:t>
-      </w:r>
-      <w:proofErr w:type="spellEnd"/>
-      <w:r>
-        <w:rPr>
-          <w:rFonts w:ascii="Times New Roman" w:hAnsi="Times New Roman" w:cs="Times New Roman"/>
-          <w:sz w:val="24"/>
-          <w:szCs w:val="24"/>
-          <w:lang w:val="en-GB"/>
-        </w:rPr>
-        <w:t xml:space="preserve"> job on the </w:t>
+        <w:t> to learn how to use cron, in the code above a Sudo command will be run on the script file that I created. The script file includes each of the mongo export connection strings to the collections. Without calling the sudo command on the script file, the cron job was not running correctly, and the records were not coming in. </w:t>
+      </w:r>
+    </w:p>
+    <w:p>
+      <w:pPr>
+        <w:spacing w:line="360" w:lineRule="auto"/>
+        <w:rPr>
+          <w:rFonts w:ascii="Times New Roman" w:hAnsi="Times New Roman" w:cs="Times New Roman"/>
+          <w:sz w:val="24"/>
+          <w:szCs w:val="24"/>
+          <w:lang w:val="en-GB"/>
+        </w:rPr>
+      </w:pPr>
+      <w:r>
+        <w:rPr>
+          <w:rFonts w:ascii="Times New Roman" w:hAnsi="Times New Roman" w:cs="Times New Roman"/>
+          <w:sz w:val="24"/>
+          <w:szCs w:val="24"/>
+          <w:lang w:val="en-GB"/>
+        </w:rPr>
+        <w:t xml:space="preserve">For our database security we now have both a local backup and a backup running on a cron job on the </w:t>
       </w:r>
       <w:r>
         <w:rPr>
@@ -6190,7 +5062,7 @@
           <w:lang w:val="en-GB"/>
         </w:rPr>
         <w:drawing>
-          <wp:inline distT="0" distB="0" distL="0" distR="0" wp14:anchorId="7A0EC5B7" wp14:editId="13C153F4">
+          <wp:inline distT="0" distB="0" distL="0" distR="0" wp14:anchorId="343E3D69" wp14:editId="78191170">
             <wp:extent cx="5731510" cy="1427871"/>
             <wp:effectExtent l="0" t="0" r="2540" b="1270"/>
             <wp:docPr id="2126007471" name="Picture 15" descr="A screen shot of a computer&#10;&#10;Description automatically generated"/>
@@ -6308,7 +5180,7 @@
           <w:lang w:val="en-GB"/>
         </w:rPr>
         <w:drawing>
-          <wp:inline distT="0" distB="0" distL="0" distR="0" wp14:anchorId="005D0218" wp14:editId="373FCFC1">
+          <wp:inline distT="0" distB="0" distL="0" distR="0" wp14:anchorId="2D68BD6B" wp14:editId="26378498">
             <wp:extent cx="5731510" cy="1137920"/>
             <wp:effectExtent l="0" t="0" r="2540" b="5080"/>
             <wp:docPr id="1834311036" name="Picture 16" descr="A screen shot of a computer&#10;&#10;Description automatically generated"/>
@@ -6413,7 +5285,7 @@
           <w:lang w:val="en-GB"/>
         </w:rPr>
         <w:drawing>
-          <wp:inline distT="0" distB="0" distL="0" distR="0" wp14:anchorId="43F91918" wp14:editId="120338A4">
+          <wp:inline distT="0" distB="0" distL="0" distR="0" wp14:anchorId="3AE68313" wp14:editId="383F5129">
             <wp:extent cx="5731510" cy="1266093"/>
             <wp:effectExtent l="0" t="0" r="2540" b="0"/>
             <wp:docPr id="333340388" name="Picture 1" descr="A screen shot of a computer&#10;&#10;Description automatically generated"/>
@@ -6497,7 +5369,7 @@
           <w:lang w:val="en-GB"/>
         </w:rPr>
         <w:drawing>
-          <wp:inline distT="0" distB="0" distL="0" distR="0" wp14:anchorId="12F3CB1E" wp14:editId="5199C903">
+          <wp:inline distT="0" distB="0" distL="0" distR="0" wp14:anchorId="701962E4" wp14:editId="0B19CEA4">
             <wp:extent cx="5731510" cy="1996440"/>
             <wp:effectExtent l="0" t="0" r="2540" b="3810"/>
             <wp:docPr id="265396102" name="Picture 17" descr="A screenshot of a computer&#10;&#10;Description automatically generated"/>
@@ -6609,6 +5481,249 @@
         <w:ind w:left="360"/>
         <w:rPr>
           <w:rFonts w:ascii="Times New Roman" w:hAnsi="Times New Roman" w:cs="Times New Roman"/>
+          <w:b/>
+          <w:bCs/>
+          <w:sz w:val="28"/>
+          <w:szCs w:val="28"/>
+          <w:lang w:val="en-GB"/>
+        </w:rPr>
+      </w:pPr>
+      <w:r>
+        <w:rPr>
+          <w:rFonts w:ascii="Times New Roman" w:hAnsi="Times New Roman" w:cs="Times New Roman"/>
+          <w:b/>
+          <w:bCs/>
+          <w:sz w:val="28"/>
+          <w:szCs w:val="28"/>
+          <w:lang w:val="en-GB"/>
+        </w:rPr>
+        <w:t>Public and private keys</w:t>
+      </w:r>
+    </w:p>
+    <w:p>
+      <w:pPr>
+        <w:spacing w:line="360" w:lineRule="auto"/>
+        <w:ind w:left="360"/>
+        <w:rPr>
+          <w:rFonts w:ascii="Times New Roman" w:hAnsi="Times New Roman" w:cs="Times New Roman"/>
+          <w:sz w:val="24"/>
+          <w:szCs w:val="24"/>
+        </w:rPr>
+      </w:pPr>
+      <w:r>
+        <w:rPr>
+          <w:rFonts w:ascii="Times New Roman" w:hAnsi="Times New Roman" w:cs="Times New Roman"/>
+          <w:sz w:val="24"/>
+          <w:szCs w:val="24"/>
+        </w:rPr>
+        <w:t xml:space="preserve">It was essential that security was in place for the AWS instance so that an unauthorised user does not gain access and destroy the server. As I was creating the instance I created a key pair so that it removed the need of a username and password and provides a much tighter security as a user would need the private key to access the server. To test this I </w:t>
+      </w:r>
+      <w:r>
+        <w:rPr>
+          <w:rFonts w:ascii="Times New Roman" w:hAnsi="Times New Roman" w:cs="Times New Roman"/>
+          <w:sz w:val="24"/>
+          <w:szCs w:val="24"/>
+        </w:rPr>
+        <w:lastRenderedPageBreak/>
+        <w:t xml:space="preserve">attempted to login as ubuntu to access the server without the private key and my access was immediately denied. </w:t>
+      </w:r>
+    </w:p>
+    <w:p>
+      <w:pPr>
+        <w:spacing w:line="360" w:lineRule="auto"/>
+        <w:ind w:left="360"/>
+        <w:rPr>
+          <w:rFonts w:ascii="Times New Roman" w:hAnsi="Times New Roman" w:cs="Times New Roman"/>
+          <w:sz w:val="24"/>
+          <w:szCs w:val="24"/>
+        </w:rPr>
+      </w:pPr>
+      <w:r>
+        <w:rPr>
+          <w:rFonts w:ascii="Times New Roman" w:hAnsi="Times New Roman" w:cs="Times New Roman"/>
+          <w:noProof/>
+          <w:sz w:val="24"/>
+          <w:szCs w:val="24"/>
+        </w:rPr>
+        <w:drawing>
+          <wp:inline distT="0" distB="0" distL="0" distR="0" wp14:anchorId="57232062" wp14:editId="799E3E58">
+            <wp:extent cx="5876014" cy="1956021"/>
+            <wp:effectExtent l="0" t="0" r="0" b="6350"/>
+            <wp:docPr id="984079125" name="Picture 2" descr="A screenshot of a computer error message&#10;&#10;Description automatically generated"/>
+            <wp:cNvGraphicFramePr>
+              <a:graphicFrameLocks xmlns:a="http://schemas.openxmlformats.org/drawingml/2006/main" noChangeAspect="1"/>
+            </wp:cNvGraphicFramePr>
+            <a:graphic xmlns:a="http://schemas.openxmlformats.org/drawingml/2006/main">
+              <a:graphicData uri="http://schemas.openxmlformats.org/drawingml/2006/picture">
+                <pic:pic xmlns:pic="http://schemas.openxmlformats.org/drawingml/2006/picture">
+                  <pic:nvPicPr>
+                    <pic:cNvPr id="984079125" name="Picture 2" descr="A screenshot of a computer error message&#10;&#10;Description automatically generated"/>
+                    <pic:cNvPicPr>
+                      <a:picLocks noChangeAspect="1" noChangeArrowheads="1"/>
+                    </pic:cNvPicPr>
+                  </pic:nvPicPr>
+                  <pic:blipFill>
+                    <a:blip r:embed="rId37" cstate="print">
+                      <a:extLst>
+                        <a:ext uri="{28A0092B-C50C-407E-A947-70E740481C1C}">
+                          <a14:useLocalDpi xmlns:a14="http://schemas.microsoft.com/office/drawing/2010/main" val="0"/>
+                        </a:ext>
+                      </a:extLst>
+                    </a:blip>
+                    <a:srcRect/>
+                    <a:stretch>
+                      <a:fillRect/>
+                    </a:stretch>
+                  </pic:blipFill>
+                  <pic:spPr bwMode="auto">
+                    <a:xfrm>
+                      <a:off x="0" y="0"/>
+                      <a:ext cx="5884450" cy="1958829"/>
+                    </a:xfrm>
+                    <a:prstGeom prst="rect">
+                      <a:avLst/>
+                    </a:prstGeom>
+                    <a:noFill/>
+                  </pic:spPr>
+                </pic:pic>
+              </a:graphicData>
+            </a:graphic>
+          </wp:inline>
+        </w:drawing>
+      </w:r>
+    </w:p>
+    <w:p>
+      <w:pPr>
+        <w:spacing w:line="360" w:lineRule="auto"/>
+        <w:ind w:left="360"/>
+        <w:rPr>
+          <w:rFonts w:ascii="Times New Roman" w:hAnsi="Times New Roman" w:cs="Times New Roman"/>
+          <w:sz w:val="24"/>
+          <w:szCs w:val="24"/>
+        </w:rPr>
+      </w:pPr>
+      <w:r>
+        <w:rPr>
+          <w:rFonts w:ascii="Times New Roman" w:hAnsi="Times New Roman" w:cs="Times New Roman"/>
+          <w:sz w:val="24"/>
+          <w:szCs w:val="24"/>
+        </w:rPr>
+        <w:t xml:space="preserve">To test the correct connection I attached the .ppk file that allowed PuTTY to recognise the private key and was able to successfully SSH into the instance. </w:t>
+      </w:r>
+    </w:p>
+    <w:p>
+      <w:pPr>
+        <w:spacing w:line="360" w:lineRule="auto"/>
+        <w:ind w:left="360"/>
+        <w:rPr>
+          <w:rFonts w:ascii="Times New Roman" w:hAnsi="Times New Roman" w:cs="Times New Roman"/>
+          <w:sz w:val="24"/>
+          <w:szCs w:val="24"/>
+        </w:rPr>
+      </w:pPr>
+      <w:r>
+        <w:rPr>
+          <w:rFonts w:ascii="Times New Roman" w:hAnsi="Times New Roman" w:cs="Times New Roman"/>
+          <w:noProof/>
+          <w:sz w:val="24"/>
+          <w:szCs w:val="24"/>
+        </w:rPr>
+        <w:drawing>
+          <wp:inline distT="0" distB="0" distL="0" distR="0" wp14:anchorId="46CAA1A4" wp14:editId="66A7EB2A">
+            <wp:extent cx="5875655" cy="1934883"/>
+            <wp:effectExtent l="0" t="0" r="0" b="8255"/>
+            <wp:docPr id="1742439504" name="Picture 3" descr="A screen shot of a computer&#10;&#10;Description automatically generated"/>
+            <wp:cNvGraphicFramePr>
+              <a:graphicFrameLocks xmlns:a="http://schemas.openxmlformats.org/drawingml/2006/main" noChangeAspect="1"/>
+            </wp:cNvGraphicFramePr>
+            <a:graphic xmlns:a="http://schemas.openxmlformats.org/drawingml/2006/main">
+              <a:graphicData uri="http://schemas.openxmlformats.org/drawingml/2006/picture">
+                <pic:pic xmlns:pic="http://schemas.openxmlformats.org/drawingml/2006/picture">
+                  <pic:nvPicPr>
+                    <pic:cNvPr id="1742439504" name="Picture 3" descr="A screen shot of a computer&#10;&#10;Description automatically generated"/>
+                    <pic:cNvPicPr>
+                      <a:picLocks noChangeAspect="1" noChangeArrowheads="1"/>
+                    </pic:cNvPicPr>
+                  </pic:nvPicPr>
+                  <pic:blipFill>
+                    <a:blip r:embed="rId38">
+                      <a:extLst>
+                        <a:ext uri="{28A0092B-C50C-407E-A947-70E740481C1C}">
+                          <a14:useLocalDpi xmlns:a14="http://schemas.microsoft.com/office/drawing/2010/main" val="0"/>
+                        </a:ext>
+                      </a:extLst>
+                    </a:blip>
+                    <a:srcRect/>
+                    <a:stretch>
+                      <a:fillRect/>
+                    </a:stretch>
+                  </pic:blipFill>
+                  <pic:spPr bwMode="auto">
+                    <a:xfrm>
+                      <a:off x="0" y="0"/>
+                      <a:ext cx="5882063" cy="1936993"/>
+                    </a:xfrm>
+                    <a:prstGeom prst="rect">
+                      <a:avLst/>
+                    </a:prstGeom>
+                    <a:noFill/>
+                  </pic:spPr>
+                </pic:pic>
+              </a:graphicData>
+            </a:graphic>
+          </wp:inline>
+        </w:drawing>
+      </w:r>
+    </w:p>
+    <w:p>
+      <w:pPr>
+        <w:spacing w:line="360" w:lineRule="auto"/>
+        <w:ind w:left="360"/>
+        <w:rPr>
+          <w:rFonts w:ascii="Times New Roman" w:hAnsi="Times New Roman" w:cs="Times New Roman"/>
+          <w:sz w:val="24"/>
+          <w:szCs w:val="24"/>
+        </w:rPr>
+      </w:pPr>
+      <w:r>
+        <w:rPr>
+          <w:rFonts w:ascii="Times New Roman" w:hAnsi="Times New Roman" w:cs="Times New Roman"/>
+          <w:sz w:val="24"/>
+          <w:szCs w:val="24"/>
+        </w:rPr>
+        <w:t xml:space="preserve">This security allows applied to WinSCP which prevents </w:t>
+      </w:r>
+      <w:r>
+        <w:rPr>
+          <w:rFonts w:ascii="Times New Roman" w:hAnsi="Times New Roman" w:cs="Times New Roman"/>
+          <w:sz w:val="24"/>
+          <w:szCs w:val="24"/>
+        </w:rPr>
+        <w:t>an attacker from</w:t>
+      </w:r>
+      <w:r>
+        <w:rPr>
+          <w:rFonts w:ascii="Times New Roman" w:hAnsi="Times New Roman" w:cs="Times New Roman"/>
+          <w:sz w:val="24"/>
+          <w:szCs w:val="24"/>
+        </w:rPr>
+        <w:t xml:space="preserve"> transferring unauthorised files into the server. Without access to the private key, the instance remains secure and rejects all other attempted access.</w:t>
+      </w:r>
+      <w:r>
+        <w:rPr>
+          <w:rFonts w:ascii="Times New Roman" w:hAnsi="Times New Roman" w:cs="Times New Roman"/>
+          <w:sz w:val="24"/>
+          <w:szCs w:val="24"/>
+        </w:rPr>
+        <w:t xml:space="preserve"> </w:t>
+      </w:r>
+    </w:p>
+    <w:p>
+      <w:pPr>
+        <w:spacing w:line="360" w:lineRule="auto"/>
+        <w:ind w:left="360"/>
+        <w:rPr>
+          <w:rFonts w:ascii="Times New Roman" w:hAnsi="Times New Roman" w:cs="Times New Roman"/>
           <w:sz w:val="24"/>
           <w:szCs w:val="24"/>
           <w:lang w:val="en-GB"/>
@@ -6627,6 +5742,150 @@
           <w:lang w:val="en-GB"/>
         </w:rPr>
       </w:pPr>
+    </w:p>
+    <w:p>
+      <w:pPr>
+        <w:pStyle w:val="ListParagraph"/>
+        <w:spacing w:line="360" w:lineRule="auto"/>
+        <w:jc w:val="center"/>
+        <w:rPr>
+          <w:rFonts w:ascii="Times New Roman" w:hAnsi="Times New Roman" w:cs="Times New Roman"/>
+          <w:b/>
+          <w:bCs/>
+          <w:sz w:val="28"/>
+          <w:szCs w:val="28"/>
+          <w:u w:val="single"/>
+          <w:lang w:val="en-GB"/>
+        </w:rPr>
+      </w:pPr>
+      <w:r>
+        <w:rPr>
+          <w:rFonts w:ascii="Times New Roman" w:hAnsi="Times New Roman" w:cs="Times New Roman"/>
+          <w:b/>
+          <w:bCs/>
+          <w:sz w:val="26"/>
+          <w:szCs w:val="26"/>
+          <w:lang w:val="en-GB"/>
+        </w:rPr>
+        <w:t>4.5</w:t>
+      </w:r>
+      <w:r>
+        <w:rPr>
+          <w:rFonts w:ascii="Times New Roman" w:hAnsi="Times New Roman" w:cs="Times New Roman"/>
+          <w:b/>
+          <w:bCs/>
+          <w:sz w:val="26"/>
+          <w:szCs w:val="26"/>
+          <w:lang w:val="en-GB"/>
+        </w:rPr>
+        <w:t xml:space="preserve"> </w:t>
+      </w:r>
+      <w:r>
+        <w:rPr>
+          <w:rFonts w:ascii="Times New Roman" w:hAnsi="Times New Roman" w:cs="Times New Roman"/>
+          <w:b/>
+          <w:bCs/>
+          <w:sz w:val="28"/>
+          <w:szCs w:val="28"/>
+          <w:u w:val="single"/>
+          <w:lang w:val="en-GB"/>
+        </w:rPr>
+        <w:t xml:space="preserve">Data in </w:t>
+      </w:r>
+      <w:r>
+        <w:rPr>
+          <w:rFonts w:ascii="Times New Roman" w:hAnsi="Times New Roman" w:cs="Times New Roman"/>
+          <w:b/>
+          <w:bCs/>
+          <w:sz w:val="28"/>
+          <w:szCs w:val="28"/>
+          <w:u w:val="single"/>
+          <w:lang w:val="en-GB"/>
+        </w:rPr>
+        <w:t>flow</w:t>
+      </w:r>
+      <w:r>
+        <w:rPr>
+          <w:rFonts w:ascii="Times New Roman" w:hAnsi="Times New Roman" w:cs="Times New Roman"/>
+          <w:b/>
+          <w:bCs/>
+          <w:sz w:val="28"/>
+          <w:szCs w:val="28"/>
+          <w:u w:val="single"/>
+          <w:lang w:val="en-GB"/>
+        </w:rPr>
+        <w:t xml:space="preserve"> -</w:t>
+      </w:r>
+      <w:r>
+        <w:rPr>
+          <w:rFonts w:ascii="Times New Roman" w:hAnsi="Times New Roman" w:cs="Times New Roman"/>
+          <w:b/>
+          <w:bCs/>
+          <w:sz w:val="28"/>
+          <w:szCs w:val="28"/>
+          <w:u w:val="single"/>
+          <w:lang w:val="en-GB"/>
+        </w:rPr>
+        <w:t xml:space="preserve"> Jamie</w:t>
+      </w:r>
+    </w:p>
+    <w:p>
+      <w:pPr>
+        <w:pStyle w:val="ListParagraph"/>
+        <w:spacing w:line="360" w:lineRule="auto"/>
+        <w:ind w:left="360"/>
+        <w:rPr>
+          <w:rFonts w:ascii="Times New Roman" w:hAnsi="Times New Roman" w:cs="Times New Roman"/>
+          <w:b/>
+          <w:bCs/>
+          <w:sz w:val="24"/>
+          <w:szCs w:val="24"/>
+          <w:lang w:val="en-GB"/>
+        </w:rPr>
+      </w:pPr>
+      <w:r>
+        <w:rPr>
+          <w:rFonts w:ascii="Times New Roman" w:hAnsi="Times New Roman" w:cs="Times New Roman"/>
+          <w:b/>
+          <w:bCs/>
+          <w:sz w:val="24"/>
+          <w:szCs w:val="24"/>
+          <w:lang w:val="en-GB"/>
+        </w:rPr>
+        <w:t>Sending and storing of data</w:t>
+      </w:r>
+    </w:p>
+    <w:p>
+      <w:pPr>
+        <w:pStyle w:val="ListParagraph"/>
+        <w:spacing w:line="360" w:lineRule="auto"/>
+        <w:ind w:left="360"/>
+        <w:rPr>
+          <w:rFonts w:ascii="Times New Roman" w:hAnsi="Times New Roman" w:cs="Times New Roman"/>
+          <w:sz w:val="24"/>
+          <w:szCs w:val="24"/>
+          <w:lang w:val="en-GB"/>
+        </w:rPr>
+      </w:pPr>
+      <w:r>
+        <w:rPr>
+          <w:rFonts w:ascii="Times New Roman" w:hAnsi="Times New Roman" w:cs="Times New Roman"/>
+          <w:sz w:val="24"/>
+          <w:szCs w:val="24"/>
+          <w:lang w:val="en-GB"/>
+        </w:rPr>
+        <w:t xml:space="preserve">While data is at rest on the raspberry pi, it is secured behind a username and password to access the pi. Without these login credentials access cannot be granted into the pi which manages the data. When the data is in transit between the hardware and the server a message is published to pubnub which acts as the in-between for the hardware and server. </w:t>
+      </w:r>
+      <w:r>
+        <w:rPr>
+          <w:rFonts w:ascii="Times New Roman" w:hAnsi="Times New Roman" w:cs="Times New Roman"/>
+          <w:sz w:val="24"/>
+          <w:szCs w:val="24"/>
+          <w:lang w:val="en-GB"/>
+        </w:rPr>
+        <w:lastRenderedPageBreak/>
+        <w:t>Pubnub will be secured using auth keys with access manager to ensure that the user has the appropriate permissions to be publishing messages to the Sipify-channel. Once the message is received on pubnub the server will be subscribed to Sipify-channel listening for messages and receive the message securely. Once the data is resting on the server it is secured with the key pair assigned to the cloud server. Without the private key, a user cannot access the server. The server has deployed the project which is secured with an SSL certificate to ensure https so that users can access the front-end securely. The temperature data will be secured in transit from the server with user access on the database. Similar to pubnub only certain users will have access to send data. The drinks from the database is sent securely with a combination of user access and the secure connection provided from the SSL certificate. When the user input data is sent to the server it is sent using a POST request so that the data in transit is secure. The server then sends the drink_status data to the database to be stored where it will be secured at rest by the user permissions that are stored as mentioned previously. This data is then sent to the front-end as they are redirected to the barista page.</w:t>
+      </w:r>
     </w:p>
     <w:p>
       <w:pPr>
@@ -6643,95 +5902,14 @@
           <w:lang w:val="en-GB"/>
         </w:rPr>
       </w:pPr>
-      <w:r>
-        <w:rPr>
-          <w:rFonts w:ascii="Times New Roman" w:hAnsi="Times New Roman" w:cs="Times New Roman"/>
-          <w:b/>
-          <w:bCs/>
-          <w:sz w:val="26"/>
-          <w:szCs w:val="26"/>
-          <w:lang w:val="en-GB"/>
-        </w:rPr>
-        <w:t>4.5</w:t>
-      </w:r>
-      <w:r>
-        <w:rPr>
-          <w:rFonts w:ascii="Times New Roman" w:hAnsi="Times New Roman" w:cs="Times New Roman"/>
-          <w:b/>
-          <w:bCs/>
-          <w:sz w:val="26"/>
-          <w:szCs w:val="26"/>
-          <w:lang w:val="en-GB"/>
-        </w:rPr>
-        <w:t xml:space="preserve"> </w:t>
-      </w:r>
-      <w:r>
-        <w:rPr>
-          <w:rFonts w:ascii="Times New Roman" w:hAnsi="Times New Roman" w:cs="Times New Roman"/>
-          <w:b/>
-          <w:bCs/>
-          <w:sz w:val="28"/>
-          <w:szCs w:val="28"/>
-          <w:u w:val="single"/>
-          <w:lang w:val="en-GB"/>
-        </w:rPr>
-        <w:t xml:space="preserve">Data in </w:t>
-      </w:r>
-      <w:r>
-        <w:rPr>
-          <w:rFonts w:ascii="Times New Roman" w:hAnsi="Times New Roman" w:cs="Times New Roman"/>
-          <w:b/>
-          <w:bCs/>
-          <w:sz w:val="28"/>
-          <w:szCs w:val="28"/>
-          <w:u w:val="single"/>
-          <w:lang w:val="en-GB"/>
-        </w:rPr>
-        <w:t>flow</w:t>
-      </w:r>
-      <w:r>
-        <w:rPr>
-          <w:rFonts w:ascii="Times New Roman" w:hAnsi="Times New Roman" w:cs="Times New Roman"/>
-          <w:b/>
-          <w:bCs/>
-          <w:sz w:val="28"/>
-          <w:szCs w:val="28"/>
-          <w:u w:val="single"/>
-          <w:lang w:val="en-GB"/>
-        </w:rPr>
-        <w:t xml:space="preserve"> -</w:t>
-      </w:r>
-      <w:r>
-        <w:rPr>
-          <w:rFonts w:ascii="Times New Roman" w:hAnsi="Times New Roman" w:cs="Times New Roman"/>
-          <w:b/>
-          <w:bCs/>
-          <w:sz w:val="28"/>
-          <w:szCs w:val="28"/>
-          <w:u w:val="single"/>
-          <w:lang w:val="en-GB"/>
-        </w:rPr>
-        <w:t xml:space="preserve"> </w:t>
-      </w:r>
-      <w:r>
-        <w:rPr>
-          <w:rFonts w:ascii="Times New Roman" w:hAnsi="Times New Roman" w:cs="Times New Roman"/>
-          <w:b/>
-          <w:bCs/>
-          <w:sz w:val="28"/>
-          <w:szCs w:val="28"/>
-          <w:u w:val="single"/>
-          <w:lang w:val="en-GB"/>
-        </w:rPr>
-        <w:t>Jamie</w:t>
-      </w:r>
     </w:p>
     <w:p/>
     <w:p/>
     <w:bookmarkEnd w:id="0"/>
     <w:p/>
+    <w:p/>
     <w:sectPr>
-      <w:footerReference w:type="default" r:id="rId37"/>
+      <w:footerReference w:type="default" r:id="rId39"/>
       <w:pgSz w:w="11906" w:h="16838"/>
       <w:pgMar w:top="1440" w:right="1440" w:bottom="1440" w:left="1440" w:header="708" w:footer="708" w:gutter="0"/>
       <w:pgBorders w:offsetFrom="page">
@@ -8662,7 +7840,7 @@
   <w:style w:type="paragraph" w:default="1" w:styleId="Normal">
     <w:name w:val="Normal"/>
     <w:qFormat/>
-    <w:rsid w:val="003A35D5"/>
+    <w:rsid w:val="001F558A"/>
   </w:style>
   <w:style w:type="paragraph" w:styleId="Heading1">
     <w:name w:val="heading 1"/>

</xml_diff>